<commit_message>
chore: apply Black and isort auto-formatting post-hook
</commit_message>
<xml_diff>
--- a/docs/FDM Group Project Work JW.docx
+++ b/docs/FDM Group Project Work JW.docx
@@ -192,6 +192,1175 @@
           <w:szCs w:val="27"/>
         </w:rPr>
       </w:pPr>
+    </w:p>
+    <w:p>
+      <w:pPr>
+        <w:pStyle w:val="NormalWeb"/>
+        <w:rPr>
+          <w:rFonts w:ascii="Times" w:hAnsi="Times"/>
+          <w:color w:val="000000"/>
+          <w:sz w:val="27"/>
+          <w:szCs w:val="27"/>
+        </w:rPr>
+      </w:pPr>
+      <w:r>
+        <w:rPr>
+          <w:rFonts w:ascii="Times" w:hAnsi="Times"/>
+          <w:color w:val="000000"/>
+          <w:sz w:val="27"/>
+          <w:szCs w:val="27"/>
+        </w:rPr>
+        <w:t>Brew install python</w:t>
+      </w:r>
+    </w:p>
+    <w:p>
+      <w:pPr>
+        <w:pStyle w:val="NormalWeb"/>
+        <w:rPr>
+          <w:rFonts w:ascii="Times" w:hAnsi="Times"/>
+          <w:color w:val="000000"/>
+          <w:sz w:val="27"/>
+          <w:szCs w:val="27"/>
+        </w:rPr>
+      </w:pPr>
+      <w:r>
+        <w:rPr>
+          <w:rFonts w:ascii="Times" w:hAnsi="Times"/>
+          <w:color w:val="000000"/>
+          <w:sz w:val="27"/>
+          <w:szCs w:val="27"/>
+        </w:rPr>
+        <w:t>Brew install git</w:t>
+      </w:r>
+    </w:p>
+    <w:p>
+      <w:pPr>
+        <w:pStyle w:val="NormalWeb"/>
+        <w:rPr>
+          <w:rFonts w:ascii="Times" w:hAnsi="Times"/>
+          <w:color w:val="000000"/>
+          <w:sz w:val="27"/>
+          <w:szCs w:val="27"/>
+        </w:rPr>
+      </w:pPr>
+      <w:r>
+        <w:rPr>
+          <w:rFonts w:ascii="Times" w:hAnsi="Times"/>
+          <w:color w:val="000000"/>
+          <w:sz w:val="27"/>
+          <w:szCs w:val="27"/>
+        </w:rPr>
+        <w:t>Brew install node</w:t>
+      </w:r>
+    </w:p>
+    <w:p>
+      <w:pPr>
+        <w:pStyle w:val="NormalWeb"/>
+        <w:rPr>
+          <w:rFonts w:ascii="Times" w:hAnsi="Times"/>
+          <w:color w:val="000000"/>
+          <w:sz w:val="27"/>
+          <w:szCs w:val="27"/>
+        </w:rPr>
+      </w:pPr>
+      <w:r>
+        <w:rPr>
+          <w:rFonts w:ascii="Times" w:hAnsi="Times"/>
+          <w:color w:val="000000"/>
+          <w:sz w:val="27"/>
+          <w:szCs w:val="27"/>
+        </w:rPr>
+        <w:t xml:space="preserve">#python virtual environment set up </w:t>
+      </w:r>
+    </w:p>
+    <w:p>
+      <w:pPr>
+        <w:pStyle w:val="NormalWeb"/>
+        <w:rPr>
+          <w:rFonts w:ascii="Times" w:hAnsi="Times"/>
+          <w:color w:val="000000"/>
+          <w:sz w:val="27"/>
+          <w:szCs w:val="27"/>
+        </w:rPr>
+      </w:pPr>
+      <w:r>
+        <w:rPr>
+          <w:rFonts w:ascii="Times" w:hAnsi="Times"/>
+          <w:color w:val="000000"/>
+          <w:sz w:val="27"/>
+          <w:szCs w:val="27"/>
+        </w:rPr>
+        <w:t xml:space="preserve">Python3 -m </w:t>
+      </w:r>
+      <w:proofErr w:type="spellStart"/>
+      <w:proofErr w:type="gramStart"/>
+      <w:r>
+        <w:rPr>
+          <w:rFonts w:ascii="Times" w:hAnsi="Times"/>
+          <w:color w:val="000000"/>
+          <w:sz w:val="27"/>
+          <w:szCs w:val="27"/>
+        </w:rPr>
+        <w:t>venv</w:t>
+      </w:r>
+      <w:proofErr w:type="spellEnd"/>
+      <w:r>
+        <w:rPr>
+          <w:rFonts w:ascii="Times" w:hAnsi="Times"/>
+          <w:color w:val="000000"/>
+          <w:sz w:val="27"/>
+          <w:szCs w:val="27"/>
+        </w:rPr>
+        <w:t xml:space="preserve"> .</w:t>
+      </w:r>
+      <w:proofErr w:type="spellStart"/>
+      <w:r>
+        <w:rPr>
+          <w:rFonts w:ascii="Times" w:hAnsi="Times"/>
+          <w:color w:val="000000"/>
+          <w:sz w:val="27"/>
+          <w:szCs w:val="27"/>
+        </w:rPr>
+        <w:t>venv</w:t>
+      </w:r>
+      <w:proofErr w:type="spellEnd"/>
+      <w:proofErr w:type="gramEnd"/>
+    </w:p>
+    <w:p>
+      <w:pPr>
+        <w:pStyle w:val="NormalWeb"/>
+        <w:rPr>
+          <w:rFonts w:ascii="Times" w:hAnsi="Times"/>
+          <w:color w:val="000000"/>
+          <w:sz w:val="27"/>
+          <w:szCs w:val="27"/>
+        </w:rPr>
+      </w:pPr>
+      <w:proofErr w:type="gramStart"/>
+      <w:r>
+        <w:rPr>
+          <w:rFonts w:ascii="Times" w:hAnsi="Times"/>
+          <w:color w:val="000000"/>
+          <w:sz w:val="27"/>
+          <w:szCs w:val="27"/>
+        </w:rPr>
+        <w:t>Source .</w:t>
+      </w:r>
+      <w:proofErr w:type="spellStart"/>
+      <w:r>
+        <w:rPr>
+          <w:rFonts w:ascii="Times" w:hAnsi="Times"/>
+          <w:color w:val="000000"/>
+          <w:sz w:val="27"/>
+          <w:szCs w:val="27"/>
+        </w:rPr>
+        <w:t>venv</w:t>
+      </w:r>
+      <w:proofErr w:type="spellEnd"/>
+      <w:proofErr w:type="gramEnd"/>
+      <w:r>
+        <w:rPr>
+          <w:rFonts w:ascii="Times" w:hAnsi="Times"/>
+          <w:color w:val="000000"/>
+          <w:sz w:val="27"/>
+          <w:szCs w:val="27"/>
+        </w:rPr>
+        <w:t>/bin/activate</w:t>
+      </w:r>
+    </w:p>
+    <w:p>
+      <w:pPr>
+        <w:pStyle w:val="NormalWeb"/>
+        <w:rPr>
+          <w:rFonts w:ascii="Times" w:hAnsi="Times"/>
+          <w:color w:val="000000"/>
+          <w:sz w:val="27"/>
+          <w:szCs w:val="27"/>
+        </w:rPr>
+      </w:pPr>
+      <w:r>
+        <w:rPr>
+          <w:rFonts w:ascii="Times" w:hAnsi="Times"/>
+          <w:color w:val="000000"/>
+          <w:sz w:val="27"/>
+          <w:szCs w:val="27"/>
+        </w:rPr>
+        <w:t xml:space="preserve">pip install pandas polars </w:t>
+      </w:r>
+      <w:proofErr w:type="spellStart"/>
+      <w:r>
+        <w:rPr>
+          <w:rFonts w:ascii="Times" w:hAnsi="Times"/>
+          <w:color w:val="000000"/>
+          <w:sz w:val="27"/>
+          <w:szCs w:val="27"/>
+        </w:rPr>
+        <w:t>pyspark</w:t>
+      </w:r>
+      <w:proofErr w:type="spellEnd"/>
+      <w:r>
+        <w:rPr>
+          <w:rFonts w:ascii="Times" w:hAnsi="Times"/>
+          <w:color w:val="000000"/>
+          <w:sz w:val="27"/>
+          <w:szCs w:val="27"/>
+        </w:rPr>
+        <w:t xml:space="preserve"> </w:t>
+      </w:r>
+      <w:proofErr w:type="spellStart"/>
+      <w:r>
+        <w:rPr>
+          <w:rFonts w:ascii="Times" w:hAnsi="Times"/>
+          <w:color w:val="000000"/>
+          <w:sz w:val="27"/>
+          <w:szCs w:val="27"/>
+        </w:rPr>
+        <w:t>pytest</w:t>
+      </w:r>
+      <w:proofErr w:type="spellEnd"/>
+      <w:r>
+        <w:rPr>
+          <w:rFonts w:ascii="Times" w:hAnsi="Times"/>
+          <w:color w:val="000000"/>
+          <w:sz w:val="27"/>
+          <w:szCs w:val="27"/>
+        </w:rPr>
+        <w:t xml:space="preserve"> flake8 dash </w:t>
+      </w:r>
+      <w:proofErr w:type="spellStart"/>
+      <w:r>
+        <w:rPr>
+          <w:rFonts w:ascii="Times" w:hAnsi="Times"/>
+          <w:color w:val="000000"/>
+          <w:sz w:val="27"/>
+          <w:szCs w:val="27"/>
+        </w:rPr>
+        <w:t>streamlit</w:t>
+      </w:r>
+      <w:proofErr w:type="spellEnd"/>
+      <w:r>
+        <w:rPr>
+          <w:rFonts w:ascii="Times" w:hAnsi="Times"/>
+          <w:color w:val="000000"/>
+          <w:sz w:val="27"/>
+          <w:szCs w:val="27"/>
+        </w:rPr>
+        <w:t xml:space="preserve"> scikit-learn </w:t>
+      </w:r>
+      <w:proofErr w:type="spellStart"/>
+      <w:r>
+        <w:rPr>
+          <w:rFonts w:ascii="Times" w:hAnsi="Times"/>
+          <w:color w:val="000000"/>
+          <w:sz w:val="27"/>
+          <w:szCs w:val="27"/>
+        </w:rPr>
+        <w:t>sqlalchemy</w:t>
+      </w:r>
+      <w:proofErr w:type="spellEnd"/>
+      <w:r>
+        <w:rPr>
+          <w:rFonts w:ascii="Times" w:hAnsi="Times"/>
+          <w:color w:val="000000"/>
+          <w:sz w:val="27"/>
+          <w:szCs w:val="27"/>
+        </w:rPr>
+        <w:t xml:space="preserve"> </w:t>
+      </w:r>
+      <w:proofErr w:type="spellStart"/>
+      <w:r>
+        <w:rPr>
+          <w:rFonts w:ascii="Times" w:hAnsi="Times"/>
+          <w:color w:val="000000"/>
+          <w:sz w:val="27"/>
+          <w:szCs w:val="27"/>
+        </w:rPr>
+        <w:t>dvc</w:t>
+      </w:r>
+      <w:proofErr w:type="spellEnd"/>
+    </w:p>
+    <w:p>
+      <w:pPr>
+        <w:pStyle w:val="NormalWeb"/>
+        <w:rPr>
+          <w:rFonts w:ascii="Times" w:hAnsi="Times"/>
+          <w:color w:val="000000"/>
+          <w:sz w:val="27"/>
+          <w:szCs w:val="27"/>
+        </w:rPr>
+      </w:pPr>
+      <w:r>
+        <w:rPr>
+          <w:rFonts w:ascii="Times" w:hAnsi="Times"/>
+          <w:color w:val="000000"/>
+          <w:sz w:val="27"/>
+          <w:szCs w:val="27"/>
+        </w:rPr>
+        <w:t xml:space="preserve">git </w:t>
+      </w:r>
+      <w:proofErr w:type="spellStart"/>
+      <w:r>
+        <w:rPr>
+          <w:rFonts w:ascii="Times" w:hAnsi="Times"/>
+          <w:color w:val="000000"/>
+          <w:sz w:val="27"/>
+          <w:szCs w:val="27"/>
+        </w:rPr>
+        <w:t>init</w:t>
+      </w:r>
+      <w:proofErr w:type="spellEnd"/>
+    </w:p>
+    <w:p>
+      <w:pPr>
+        <w:pStyle w:val="NormalWeb"/>
+        <w:rPr>
+          <w:rFonts w:ascii="Times" w:hAnsi="Times"/>
+          <w:color w:val="000000"/>
+          <w:sz w:val="27"/>
+          <w:szCs w:val="27"/>
+        </w:rPr>
+      </w:pPr>
+      <w:r>
+        <w:rPr>
+          <w:rFonts w:ascii="Times" w:hAnsi="Times"/>
+          <w:color w:val="000000"/>
+          <w:sz w:val="27"/>
+          <w:szCs w:val="27"/>
+        </w:rPr>
+        <w:t xml:space="preserve">git remote add origin </w:t>
+      </w:r>
+      <w:hyperlink r:id="rId4" w:history="1">
+        <w:r>
+          <w:rPr>
+            <w:rStyle w:val="Hyperlink"/>
+            <w:rFonts w:ascii="Times" w:hAnsi="Times"/>
+            <w:sz w:val="27"/>
+            <w:szCs w:val="27"/>
+          </w:rPr>
+          <w:t>https://github.com//Wadard/financial-dashboard.git</w:t>
+        </w:r>
+      </w:hyperlink>
+    </w:p>
+    <w:p>
+      <w:pPr>
+        <w:pStyle w:val="NormalWeb"/>
+        <w:rPr>
+          <w:rFonts w:ascii="Times" w:hAnsi="Times"/>
+          <w:color w:val="000000"/>
+          <w:sz w:val="27"/>
+          <w:szCs w:val="27"/>
+        </w:rPr>
+      </w:pPr>
+      <w:r>
+        <w:rPr>
+          <w:rFonts w:ascii="Times" w:hAnsi="Times"/>
+          <w:color w:val="000000"/>
+          <w:sz w:val="27"/>
+          <w:szCs w:val="27"/>
+        </w:rPr>
+        <w:t>git branch -M main</w:t>
+      </w:r>
+    </w:p>
+    <w:p>
+      <w:pPr>
+        <w:pStyle w:val="NormalWeb"/>
+        <w:rPr>
+          <w:rFonts w:ascii="Times" w:hAnsi="Times"/>
+          <w:color w:val="000000"/>
+          <w:sz w:val="27"/>
+          <w:szCs w:val="27"/>
+        </w:rPr>
+      </w:pPr>
+      <w:r>
+        <w:rPr>
+          <w:rFonts w:ascii="Times" w:hAnsi="Times"/>
+          <w:color w:val="000000"/>
+          <w:sz w:val="27"/>
+          <w:szCs w:val="27"/>
+        </w:rPr>
+        <w:t xml:space="preserve">git </w:t>
+      </w:r>
+      <w:proofErr w:type="gramStart"/>
+      <w:r>
+        <w:rPr>
+          <w:rFonts w:ascii="Times" w:hAnsi="Times"/>
+          <w:color w:val="000000"/>
+          <w:sz w:val="27"/>
+          <w:szCs w:val="27"/>
+        </w:rPr>
+        <w:t>add .</w:t>
+      </w:r>
+      <w:proofErr w:type="gramEnd"/>
+    </w:p>
+    <w:p>
+      <w:pPr>
+        <w:pStyle w:val="NormalWeb"/>
+        <w:rPr>
+          <w:rFonts w:ascii="Times" w:hAnsi="Times"/>
+          <w:color w:val="000000"/>
+          <w:sz w:val="27"/>
+          <w:szCs w:val="27"/>
+        </w:rPr>
+      </w:pPr>
+      <w:r>
+        <w:rPr>
+          <w:rFonts w:ascii="Times" w:hAnsi="Times"/>
+          <w:color w:val="000000"/>
+          <w:sz w:val="27"/>
+          <w:szCs w:val="27"/>
+        </w:rPr>
+        <w:lastRenderedPageBreak/>
+        <w:t xml:space="preserve">git commit -m "Initial scaffold for </w:t>
+      </w:r>
+      <w:proofErr w:type="spellStart"/>
+      <w:r>
+        <w:rPr>
+          <w:rFonts w:ascii="Times" w:hAnsi="Times"/>
+          <w:color w:val="000000"/>
+          <w:sz w:val="27"/>
+          <w:szCs w:val="27"/>
+        </w:rPr>
+        <w:t>financial_dashboard</w:t>
+      </w:r>
+      <w:proofErr w:type="spellEnd"/>
+      <w:r>
+        <w:rPr>
+          <w:rFonts w:ascii="Times" w:hAnsi="Times"/>
+          <w:color w:val="000000"/>
+          <w:sz w:val="27"/>
+          <w:szCs w:val="27"/>
+        </w:rPr>
+        <w:t>"</w:t>
+      </w:r>
+    </w:p>
+    <w:p>
+      <w:pPr>
+        <w:pStyle w:val="NormalWeb"/>
+        <w:rPr>
+          <w:rFonts w:ascii="Times" w:hAnsi="Times"/>
+          <w:color w:val="000000"/>
+          <w:sz w:val="27"/>
+          <w:szCs w:val="27"/>
+        </w:rPr>
+      </w:pPr>
+      <w:r>
+        <w:rPr>
+          <w:rFonts w:ascii="Times" w:hAnsi="Times"/>
+          <w:color w:val="000000"/>
+          <w:sz w:val="27"/>
+          <w:szCs w:val="27"/>
+        </w:rPr>
+        <w:t>git push -u origin main</w:t>
+      </w:r>
+    </w:p>
+    <w:p>
+      <w:pPr>
+        <w:pStyle w:val="NormalWeb"/>
+        <w:rPr>
+          <w:rFonts w:ascii="Times" w:hAnsi="Times"/>
+          <w:color w:val="000000"/>
+          <w:sz w:val="27"/>
+          <w:szCs w:val="27"/>
+        </w:rPr>
+      </w:pPr>
+      <w:r>
+        <w:rPr>
+          <w:rFonts w:ascii="Times" w:hAnsi="Times"/>
+          <w:color w:val="000000"/>
+          <w:sz w:val="27"/>
+          <w:szCs w:val="27"/>
+        </w:rPr>
+        <w:t>git checkout -b dev</w:t>
+      </w:r>
+    </w:p>
+    <w:p>
+      <w:pPr>
+        <w:pStyle w:val="NormalWeb"/>
+        <w:rPr>
+          <w:rFonts w:ascii="Times" w:hAnsi="Times"/>
+          <w:color w:val="000000"/>
+          <w:sz w:val="27"/>
+          <w:szCs w:val="27"/>
+        </w:rPr>
+      </w:pPr>
+      <w:r>
+        <w:rPr>
+          <w:rFonts w:ascii="Times" w:hAnsi="Times"/>
+          <w:color w:val="000000"/>
+          <w:sz w:val="27"/>
+          <w:szCs w:val="27"/>
+        </w:rPr>
+        <w:t>git push -u origin dev</w:t>
+      </w:r>
+    </w:p>
+    <w:p>
+      <w:pPr>
+        <w:pStyle w:val="NormalWeb"/>
+        <w:rPr>
+          <w:rFonts w:ascii="Times" w:hAnsi="Times"/>
+          <w:color w:val="000000"/>
+          <w:sz w:val="27"/>
+          <w:szCs w:val="27"/>
+        </w:rPr>
+      </w:pPr>
+      <w:r>
+        <w:rPr>
+          <w:rFonts w:ascii="Times" w:hAnsi="Times"/>
+          <w:color w:val="000000"/>
+          <w:sz w:val="27"/>
+          <w:szCs w:val="27"/>
+        </w:rPr>
+        <w:t>git checkout -b feature/data-ingestion</w:t>
+      </w:r>
+    </w:p>
+    <w:p>
+      <w:pPr>
+        <w:pStyle w:val="NormalWeb"/>
+        <w:rPr>
+          <w:rFonts w:ascii="Times" w:hAnsi="Times"/>
+          <w:color w:val="000000"/>
+          <w:sz w:val="27"/>
+          <w:szCs w:val="27"/>
+        </w:rPr>
+      </w:pPr>
+      <w:r>
+        <w:rPr>
+          <w:rFonts w:ascii="Times" w:hAnsi="Times"/>
+          <w:color w:val="000000"/>
+          <w:sz w:val="27"/>
+          <w:szCs w:val="27"/>
+        </w:rPr>
+        <w:t xml:space="preserve">git add data_ingestion/data_ingestion.py   </w:t>
+      </w:r>
+    </w:p>
+    <w:p>
+      <w:pPr>
+        <w:pStyle w:val="NormalWeb"/>
+        <w:rPr>
+          <w:rFonts w:ascii="Times" w:hAnsi="Times"/>
+          <w:color w:val="000000"/>
+          <w:sz w:val="27"/>
+          <w:szCs w:val="27"/>
+        </w:rPr>
+      </w:pPr>
+      <w:r>
+        <w:rPr>
+          <w:rFonts w:ascii="Times" w:hAnsi="Times"/>
+          <w:color w:val="000000"/>
+          <w:sz w:val="27"/>
+          <w:szCs w:val="27"/>
+        </w:rPr>
+        <w:t>git commit -m "initial data ingestion scaffold"</w:t>
+      </w:r>
+    </w:p>
+    <w:p>
+      <w:pPr>
+        <w:pStyle w:val="NormalWeb"/>
+        <w:rPr>
+          <w:rFonts w:ascii="Times" w:hAnsi="Times"/>
+          <w:color w:val="000000"/>
+          <w:sz w:val="27"/>
+          <w:szCs w:val="27"/>
+        </w:rPr>
+      </w:pPr>
+      <w:r>
+        <w:rPr>
+          <w:rFonts w:ascii="Times" w:hAnsi="Times"/>
+          <w:color w:val="000000"/>
+          <w:sz w:val="27"/>
+          <w:szCs w:val="27"/>
+        </w:rPr>
+        <w:t xml:space="preserve">git push -u origin feature/data-ingestion  </w:t>
+      </w:r>
+    </w:p>
+    <w:p>
+      <w:pPr>
+        <w:pStyle w:val="NormalWeb"/>
+        <w:rPr>
+          <w:rFonts w:ascii="Times" w:hAnsi="Times"/>
+          <w:color w:val="000000"/>
+          <w:sz w:val="27"/>
+          <w:szCs w:val="27"/>
+        </w:rPr>
+      </w:pPr>
+      <w:r>
+        <w:rPr>
+          <w:rFonts w:ascii="Times" w:hAnsi="Times"/>
+          <w:color w:val="000000"/>
+          <w:sz w:val="27"/>
+          <w:szCs w:val="27"/>
+        </w:rPr>
+        <w:t>git add .</w:t>
+      </w:r>
+      <w:proofErr w:type="spellStart"/>
+      <w:r>
+        <w:rPr>
+          <w:rFonts w:ascii="Times" w:hAnsi="Times"/>
+          <w:color w:val="000000"/>
+          <w:sz w:val="27"/>
+          <w:szCs w:val="27"/>
+        </w:rPr>
+        <w:t>github</w:t>
+      </w:r>
+      <w:proofErr w:type="spellEnd"/>
+      <w:r>
+        <w:rPr>
+          <w:rFonts w:ascii="Times" w:hAnsi="Times"/>
+          <w:color w:val="000000"/>
+          <w:sz w:val="27"/>
+          <w:szCs w:val="27"/>
+        </w:rPr>
+        <w:t>/workflows/</w:t>
+      </w:r>
+      <w:proofErr w:type="spellStart"/>
+      <w:r>
+        <w:rPr>
+          <w:rFonts w:ascii="Times" w:hAnsi="Times"/>
+          <w:color w:val="000000"/>
+          <w:sz w:val="27"/>
+          <w:szCs w:val="27"/>
+        </w:rPr>
+        <w:t>ci.yml</w:t>
+      </w:r>
+      <w:proofErr w:type="spellEnd"/>
+    </w:p>
+    <w:p>
+      <w:pPr>
+        <w:pStyle w:val="NormalWeb"/>
+        <w:rPr>
+          <w:rFonts w:ascii="Times" w:hAnsi="Times"/>
+          <w:color w:val="000000"/>
+          <w:sz w:val="27"/>
+          <w:szCs w:val="27"/>
+        </w:rPr>
+      </w:pPr>
+      <w:r>
+        <w:rPr>
+          <w:rFonts w:ascii="Times" w:hAnsi="Times"/>
+          <w:color w:val="000000"/>
+          <w:sz w:val="27"/>
+          <w:szCs w:val="27"/>
+        </w:rPr>
+        <w:t>git commit -m "add CI pipeline for dev and main"</w:t>
+      </w:r>
+    </w:p>
+    <w:p>
+      <w:pPr>
+        <w:pStyle w:val="NormalWeb"/>
+        <w:rPr>
+          <w:rFonts w:ascii="Times" w:hAnsi="Times"/>
+          <w:color w:val="000000"/>
+          <w:sz w:val="27"/>
+          <w:szCs w:val="27"/>
+        </w:rPr>
+      </w:pPr>
+      <w:r>
+        <w:rPr>
+          <w:rFonts w:ascii="Times" w:hAnsi="Times"/>
+          <w:color w:val="000000"/>
+          <w:sz w:val="27"/>
+          <w:szCs w:val="27"/>
+        </w:rPr>
+        <w:t>git push</w:t>
+      </w:r>
+    </w:p>
+    <w:p>
+      <w:pPr>
+        <w:pStyle w:val="NormalWeb"/>
+        <w:rPr>
+          <w:rFonts w:ascii="Times" w:hAnsi="Times"/>
+          <w:color w:val="000000"/>
+          <w:sz w:val="27"/>
+          <w:szCs w:val="27"/>
+        </w:rPr>
+      </w:pPr>
+      <w:r>
+        <w:rPr>
+          <w:rFonts w:ascii="Times" w:hAnsi="Times"/>
+          <w:color w:val="000000"/>
+          <w:sz w:val="27"/>
+          <w:szCs w:val="27"/>
+        </w:rPr>
+        <w:t>git add data_ingestion/data_ingestion.py tests/unit/test_data_ingestion.py</w:t>
+      </w:r>
+    </w:p>
+    <w:p>
+      <w:pPr>
+        <w:pStyle w:val="NormalWeb"/>
+        <w:rPr>
+          <w:rFonts w:ascii="Times" w:hAnsi="Times"/>
+          <w:color w:val="000000"/>
+          <w:sz w:val="27"/>
+          <w:szCs w:val="27"/>
+        </w:rPr>
+      </w:pPr>
+      <w:r>
+        <w:rPr>
+          <w:rFonts w:ascii="Times" w:hAnsi="Times"/>
+          <w:color w:val="000000"/>
+          <w:sz w:val="27"/>
+          <w:szCs w:val="27"/>
+        </w:rPr>
+        <w:t>git commit -m "Fix flake8 linting errors for ingestion and tests"</w:t>
+      </w:r>
+    </w:p>
+    <w:p>
+      <w:pPr>
+        <w:pStyle w:val="NormalWeb"/>
+        <w:rPr>
+          <w:rFonts w:ascii="Times" w:hAnsi="Times"/>
+          <w:color w:val="000000"/>
+          <w:sz w:val="27"/>
+          <w:szCs w:val="27"/>
+        </w:rPr>
+      </w:pPr>
+      <w:r>
+        <w:rPr>
+          <w:rFonts w:ascii="Times" w:hAnsi="Times"/>
+          <w:color w:val="000000"/>
+          <w:sz w:val="27"/>
+          <w:szCs w:val="27"/>
+        </w:rPr>
+        <w:t>git push origin feature/data-ingestion</w:t>
+      </w:r>
+    </w:p>
+    <w:p>
+      <w:pPr>
+        <w:pStyle w:val="NormalWeb"/>
+        <w:rPr>
+          <w:rFonts w:ascii="Times" w:hAnsi="Times"/>
+          <w:color w:val="000000"/>
+          <w:sz w:val="27"/>
+          <w:szCs w:val="27"/>
+        </w:rPr>
+      </w:pPr>
+      <w:r>
+        <w:rPr>
+          <w:rFonts w:ascii="Times" w:hAnsi="Times"/>
+          <w:color w:val="000000"/>
+          <w:sz w:val="27"/>
+          <w:szCs w:val="27"/>
+        </w:rPr>
+        <w:t xml:space="preserve">git </w:t>
+      </w:r>
+      <w:proofErr w:type="gramStart"/>
+      <w:r>
+        <w:rPr>
+          <w:rFonts w:ascii="Times" w:hAnsi="Times"/>
+          <w:color w:val="000000"/>
+          <w:sz w:val="27"/>
+          <w:szCs w:val="27"/>
+        </w:rPr>
+        <w:t>add .flake8 .pre</w:t>
+      </w:r>
+      <w:proofErr w:type="gramEnd"/>
+      <w:r>
+        <w:rPr>
+          <w:rFonts w:ascii="Times" w:hAnsi="Times"/>
+          <w:color w:val="000000"/>
+          <w:sz w:val="27"/>
+          <w:szCs w:val="27"/>
+        </w:rPr>
+        <w:t>-commit-</w:t>
+      </w:r>
+      <w:proofErr w:type="spellStart"/>
+      <w:proofErr w:type="gramStart"/>
+      <w:r>
+        <w:rPr>
+          <w:rFonts w:ascii="Times" w:hAnsi="Times"/>
+          <w:color w:val="000000"/>
+          <w:sz w:val="27"/>
+          <w:szCs w:val="27"/>
+        </w:rPr>
+        <w:t>config.yaml</w:t>
+      </w:r>
+      <w:proofErr w:type="spellEnd"/>
+      <w:proofErr w:type="gramEnd"/>
+      <w:r>
+        <w:rPr>
+          <w:rFonts w:ascii="Times" w:hAnsi="Times"/>
+          <w:color w:val="000000"/>
+          <w:sz w:val="27"/>
+          <w:szCs w:val="27"/>
+        </w:rPr>
+        <w:t xml:space="preserve">  </w:t>
+      </w:r>
+    </w:p>
+    <w:p>
+      <w:pPr>
+        <w:pStyle w:val="NormalWeb"/>
+        <w:rPr>
+          <w:rFonts w:ascii="Times" w:hAnsi="Times"/>
+          <w:color w:val="000000"/>
+          <w:sz w:val="27"/>
+          <w:szCs w:val="27"/>
+        </w:rPr>
+      </w:pPr>
+      <w:r>
+        <w:rPr>
+          <w:rFonts w:ascii="Times" w:hAnsi="Times"/>
+          <w:color w:val="000000"/>
+          <w:sz w:val="27"/>
+          <w:szCs w:val="27"/>
+        </w:rPr>
+        <w:t>git commit -m "Add flake8 and pre-commit config files"</w:t>
+      </w:r>
+    </w:p>
+    <w:p>
+      <w:pPr>
+        <w:pStyle w:val="NormalWeb"/>
+        <w:rPr>
+          <w:rFonts w:ascii="Times" w:hAnsi="Times"/>
+          <w:color w:val="000000"/>
+          <w:sz w:val="27"/>
+          <w:szCs w:val="27"/>
+        </w:rPr>
+      </w:pPr>
+      <w:r>
+        <w:rPr>
+          <w:rFonts w:ascii="Times" w:hAnsi="Times"/>
+          <w:color w:val="000000"/>
+          <w:sz w:val="27"/>
+          <w:szCs w:val="27"/>
+        </w:rPr>
+        <w:t>git push origin feature/data-ingestion</w:t>
+      </w:r>
+    </w:p>
+    <w:p>
+      <w:pPr>
+        <w:pStyle w:val="NormalWeb"/>
+        <w:rPr>
+          <w:rFonts w:ascii="Times" w:hAnsi="Times"/>
+          <w:color w:val="000000"/>
+          <w:sz w:val="27"/>
+          <w:szCs w:val="27"/>
+        </w:rPr>
+      </w:pPr>
+      <w:r>
+        <w:rPr>
+          <w:rFonts w:ascii="Times" w:hAnsi="Times"/>
+          <w:color w:val="000000"/>
+          <w:sz w:val="27"/>
+          <w:szCs w:val="27"/>
+        </w:rPr>
+        <w:t xml:space="preserve">git </w:t>
+      </w:r>
+      <w:proofErr w:type="gramStart"/>
+      <w:r>
+        <w:rPr>
+          <w:rFonts w:ascii="Times" w:hAnsi="Times"/>
+          <w:color w:val="000000"/>
+          <w:sz w:val="27"/>
+          <w:szCs w:val="27"/>
+        </w:rPr>
+        <w:t>add .</w:t>
+      </w:r>
+      <w:proofErr w:type="gramEnd"/>
+      <w:r>
+        <w:rPr>
+          <w:rFonts w:ascii="Times" w:hAnsi="Times"/>
+          <w:color w:val="000000"/>
+          <w:sz w:val="27"/>
+          <w:szCs w:val="27"/>
+        </w:rPr>
+        <w:br/>
+      </w:r>
+      <w:r>
+        <w:rPr>
+          <w:rFonts w:ascii="Times" w:hAnsi="Times"/>
+          <w:color w:val="000000"/>
+          <w:sz w:val="27"/>
+          <w:szCs w:val="27"/>
+        </w:rPr>
+        <w:br/>
+      </w:r>
+      <w:r>
+        <w:rPr>
+          <w:rFonts w:ascii="Times" w:hAnsi="Times"/>
+          <w:color w:val="000000"/>
+          <w:sz w:val="27"/>
+          <w:szCs w:val="27"/>
+        </w:rPr>
+        <w:t>git commit -m "feat: add ingestion pipeline, real data tests, CI &amp; hooks.</w:t>
+      </w:r>
+      <w:r>
+        <w:rPr>
+          <w:rFonts w:ascii="Times" w:hAnsi="Times"/>
+          <w:color w:val="000000"/>
+          <w:sz w:val="27"/>
+          <w:szCs w:val="27"/>
+        </w:rPr>
+        <w:t xml:space="preserve"> </w:t>
+      </w:r>
+      <w:proofErr w:type="spellStart"/>
+      <w:proofErr w:type="gramStart"/>
+      <w:r>
+        <w:rPr>
+          <w:rFonts w:ascii="Times" w:hAnsi="Times"/>
+          <w:color w:val="000000"/>
+          <w:sz w:val="27"/>
+          <w:szCs w:val="27"/>
+        </w:rPr>
+        <w:t>Refac</w:t>
+      </w:r>
+      <w:proofErr w:type="spellEnd"/>
+      <w:proofErr w:type="gramEnd"/>
+    </w:p>
+    <w:p>
+      <w:pPr>
+        <w:pStyle w:val="NormalWeb"/>
+        <w:rPr>
+          <w:rFonts w:ascii="Times" w:hAnsi="Times"/>
+          <w:color w:val="000000"/>
+          <w:sz w:val="27"/>
+          <w:szCs w:val="27"/>
+        </w:rPr>
+      </w:pPr>
+      <w:r>
+        <w:rPr>
+          <w:rFonts w:ascii="Times" w:hAnsi="Times"/>
+          <w:color w:val="000000"/>
+          <w:sz w:val="27"/>
+          <w:szCs w:val="27"/>
+        </w:rPr>
+        <w:t>tor project structure and file naming for clarity"</w:t>
+      </w:r>
+    </w:p>
+    <w:p>
+      <w:pPr>
+        <w:pStyle w:val="NormalWeb"/>
+        <w:rPr>
+          <w:rFonts w:ascii="Times" w:hAnsi="Times"/>
+          <w:color w:val="000000"/>
+          <w:sz w:val="27"/>
+          <w:szCs w:val="27"/>
+        </w:rPr>
+      </w:pPr>
+      <w:r>
+        <w:rPr>
+          <w:rFonts w:ascii="Times" w:hAnsi="Times"/>
+          <w:color w:val="000000"/>
+          <w:sz w:val="27"/>
+          <w:szCs w:val="27"/>
+        </w:rPr>
+        <w:t>git push origin feature/data-ingestion</w:t>
+      </w:r>
+    </w:p>
+    <w:p>
+      <w:pPr>
+        <w:pStyle w:val="NormalWeb"/>
+        <w:rPr>
+          <w:rFonts w:ascii="Times" w:hAnsi="Times"/>
+          <w:color w:val="000000"/>
+          <w:sz w:val="27"/>
+          <w:szCs w:val="27"/>
+        </w:rPr>
+      </w:pPr>
+      <w:r>
+        <w:rPr>
+          <w:rFonts w:ascii="Times" w:hAnsi="Times"/>
+          <w:color w:val="000000"/>
+          <w:sz w:val="27"/>
+          <w:szCs w:val="27"/>
+        </w:rPr>
+        <w:t>git add data_ingestion/pipeline.py \</w:t>
+      </w:r>
+    </w:p>
+    <w:p>
+      <w:pPr>
+        <w:pStyle w:val="NormalWeb"/>
+        <w:rPr>
+          <w:rFonts w:ascii="Times" w:hAnsi="Times"/>
+          <w:color w:val="000000"/>
+          <w:sz w:val="27"/>
+          <w:szCs w:val="27"/>
+        </w:rPr>
+      </w:pPr>
+      <w:r>
+        <w:rPr>
+          <w:rFonts w:ascii="Times" w:hAnsi="Times"/>
+          <w:color w:val="000000"/>
+          <w:sz w:val="27"/>
+          <w:szCs w:val="27"/>
+        </w:rPr>
+        <w:t xml:space="preserve">        tests/integration/test_transactions_ingestion.py \</w:t>
+      </w:r>
+    </w:p>
+    <w:p>
+      <w:pPr>
+        <w:pStyle w:val="NormalWeb"/>
+        <w:rPr>
+          <w:rFonts w:ascii="Times" w:hAnsi="Times"/>
+          <w:color w:val="000000"/>
+          <w:sz w:val="27"/>
+          <w:szCs w:val="27"/>
+        </w:rPr>
+      </w:pPr>
+      <w:r>
+        <w:rPr>
+          <w:rFonts w:ascii="Times" w:hAnsi="Times"/>
+          <w:color w:val="000000"/>
+          <w:sz w:val="27"/>
+          <w:szCs w:val="27"/>
+        </w:rPr>
+        <w:t xml:space="preserve">        tests/unit/test_data_ingestion.py \</w:t>
+      </w:r>
+    </w:p>
+    <w:p>
+      <w:pPr>
+        <w:pStyle w:val="NormalWeb"/>
+        <w:rPr>
+          <w:rFonts w:ascii="Times" w:hAnsi="Times"/>
+          <w:color w:val="000000"/>
+          <w:sz w:val="27"/>
+          <w:szCs w:val="27"/>
+        </w:rPr>
+      </w:pPr>
+      <w:r>
+        <w:rPr>
+          <w:rFonts w:ascii="Times" w:hAnsi="Times"/>
+          <w:color w:val="000000"/>
+          <w:sz w:val="27"/>
+          <w:szCs w:val="27"/>
+        </w:rPr>
+        <w:lastRenderedPageBreak/>
+        <w:t xml:space="preserve">        utils/parquet_utils.py</w:t>
+      </w:r>
+    </w:p>
+    <w:p>
+      <w:pPr>
+        <w:pStyle w:val="NormalWeb"/>
+        <w:rPr>
+          <w:rFonts w:ascii="Times" w:hAnsi="Times"/>
+          <w:color w:val="000000"/>
+          <w:sz w:val="27"/>
+          <w:szCs w:val="27"/>
+        </w:rPr>
+      </w:pPr>
+      <w:r>
+        <w:rPr>
+          <w:rFonts w:ascii="Times" w:hAnsi="Times"/>
+          <w:color w:val="000000"/>
+          <w:sz w:val="27"/>
+          <w:szCs w:val="27"/>
+        </w:rPr>
+        <w:t xml:space="preserve">git commit -m "chore: apply Black and </w:t>
+      </w:r>
+      <w:proofErr w:type="spellStart"/>
+      <w:r>
+        <w:rPr>
+          <w:rFonts w:ascii="Times" w:hAnsi="Times"/>
+          <w:color w:val="000000"/>
+          <w:sz w:val="27"/>
+          <w:szCs w:val="27"/>
+        </w:rPr>
+        <w:t>isort</w:t>
+      </w:r>
+      <w:proofErr w:type="spellEnd"/>
+      <w:r>
+        <w:rPr>
+          <w:rFonts w:ascii="Times" w:hAnsi="Times"/>
+          <w:color w:val="000000"/>
+          <w:sz w:val="27"/>
+          <w:szCs w:val="27"/>
+        </w:rPr>
+        <w:t xml:space="preserve"> auto-formatting post-hook"</w:t>
+      </w:r>
+    </w:p>
+    <w:p>
+      <w:pPr>
+        <w:pStyle w:val="NormalWeb"/>
+        <w:rPr>
+          <w:rFonts w:ascii="Times" w:hAnsi="Times"/>
+          <w:color w:val="000000"/>
+          <w:sz w:val="27"/>
+          <w:szCs w:val="27"/>
+        </w:rPr>
+      </w:pPr>
+      <w:r>
+        <w:rPr>
+          <w:rFonts w:ascii="Times" w:hAnsi="Times"/>
+          <w:color w:val="000000"/>
+          <w:sz w:val="27"/>
+          <w:szCs w:val="27"/>
+        </w:rPr>
+        <w:t>git push origin feature/data-ingestion</w:t>
+      </w:r>
+    </w:p>
+    <w:p>
+      <w:pPr>
+        <w:pStyle w:val="NormalWeb"/>
+        <w:rPr>
+          <w:rFonts w:ascii="Times" w:hAnsi="Times"/>
+          <w:color w:val="000000"/>
+          <w:sz w:val="27"/>
+          <w:szCs w:val="27"/>
+        </w:rPr>
+      </w:pPr>
+    </w:p>
+    <w:p>
+      <w:pPr>
+        <w:pStyle w:val="NormalWeb"/>
+        <w:rPr>
+          <w:rFonts w:ascii="Times" w:hAnsi="Times"/>
+          <w:color w:val="000000"/>
+          <w:sz w:val="27"/>
+          <w:szCs w:val="27"/>
+        </w:rPr>
+      </w:pPr>
+    </w:p>
+    <w:p>
+      <w:pPr>
+        <w:pStyle w:val="NormalWeb"/>
+        <w:rPr>
+          <w:rFonts w:ascii="Times" w:hAnsi="Times"/>
+          <w:color w:val="000000"/>
+          <w:sz w:val="27"/>
+          <w:szCs w:val="27"/>
+        </w:rPr>
+      </w:pPr>
+    </w:p>
+    <w:p>
+      <w:pPr>
+        <w:pStyle w:val="NormalWeb"/>
+        <w:rPr>
+          <w:rFonts w:ascii="Times" w:hAnsi="Times"/>
+          <w:color w:val="000000"/>
+          <w:sz w:val="27"/>
+          <w:szCs w:val="27"/>
+        </w:rPr>
+      </w:pPr>
+      <w:r>
+        <w:rPr>
+          <w:rFonts w:ascii="Times" w:hAnsi="Times"/>
+          <w:color w:val="000000"/>
+          <w:sz w:val="27"/>
+          <w:szCs w:val="27"/>
+        </w:rPr>
+        <w:t>Pip install requirements.txt</w:t>
+      </w:r>
+    </w:p>
+    <w:p>
+      <w:pPr>
+        <w:pStyle w:val="NormalWeb"/>
+        <w:rPr>
+          <w:rFonts w:ascii="Times" w:hAnsi="Times"/>
+          <w:color w:val="000000"/>
+          <w:sz w:val="27"/>
+          <w:szCs w:val="27"/>
+        </w:rPr>
+      </w:pPr>
+    </w:p>
+    <w:p>
+      <w:pPr>
+        <w:pStyle w:val="NormalWeb"/>
+        <w:rPr>
+          <w:rFonts w:ascii="Times" w:hAnsi="Times"/>
+          <w:color w:val="000000"/>
+          <w:sz w:val="27"/>
+          <w:szCs w:val="27"/>
+        </w:rPr>
+      </w:pPr>
       <w:r>
         <w:rPr>
           <w:rFonts w:ascii="Times" w:hAnsi="Times"/>
@@ -470,47 +1639,47 @@
           <w:sz w:val="27"/>
           <w:szCs w:val="27"/>
         </w:rPr>
+        <w:t>Integrate the model with the data pipeline</w:t>
+      </w:r>
+    </w:p>
+    <w:p>
+      <w:pPr>
+        <w:pStyle w:val="NormalWeb"/>
+        <w:rPr>
+          <w:rFonts w:ascii="Times" w:hAnsi="Times"/>
+          <w:color w:val="000000"/>
+          <w:sz w:val="27"/>
+          <w:szCs w:val="27"/>
+        </w:rPr>
+      </w:pPr>
+      <w:r>
+        <w:rPr>
+          <w:rFonts w:ascii="Times" w:hAnsi="Times"/>
+          <w:color w:val="000000"/>
+          <w:sz w:val="27"/>
+          <w:szCs w:val="27"/>
+        </w:rPr>
+        <w:t>Implement a module that mimics MERIT functionality for model execution and reporting</w:t>
+      </w:r>
+    </w:p>
+    <w:p>
+      <w:pPr>
+        <w:pStyle w:val="NormalWeb"/>
+        <w:rPr>
+          <w:rFonts w:ascii="Times" w:hAnsi="Times"/>
+          <w:color w:val="000000"/>
+          <w:sz w:val="27"/>
+          <w:szCs w:val="27"/>
+        </w:rPr>
+      </w:pPr>
+      <w:r>
+        <w:rPr>
+          <w:rFonts w:ascii="Times" w:hAnsi="Times"/>
+          <w:color w:val="000000"/>
+          <w:sz w:val="27"/>
+          <w:szCs w:val="27"/>
+        </w:rPr>
         <w:lastRenderedPageBreak/>
-        <w:t>Integrate the model with the data pipeline</w:t>
-      </w:r>
-    </w:p>
-    <w:p>
-      <w:pPr>
-        <w:pStyle w:val="NormalWeb"/>
-        <w:rPr>
-          <w:rFonts w:ascii="Times" w:hAnsi="Times"/>
-          <w:color w:val="000000"/>
-          <w:sz w:val="27"/>
-          <w:szCs w:val="27"/>
-        </w:rPr>
-      </w:pPr>
-      <w:r>
-        <w:rPr>
-          <w:rFonts w:ascii="Times" w:hAnsi="Times"/>
-          <w:color w:val="000000"/>
-          <w:sz w:val="27"/>
-          <w:szCs w:val="27"/>
-        </w:rPr>
-        <w:t>Implement a module that mimics MERIT functionality for model execution and reporting</w:t>
-      </w:r>
-    </w:p>
-    <w:p>
-      <w:pPr>
-        <w:pStyle w:val="NormalWeb"/>
-        <w:rPr>
-          <w:rFonts w:ascii="Times" w:hAnsi="Times"/>
-          <w:color w:val="000000"/>
-          <w:sz w:val="27"/>
-          <w:szCs w:val="27"/>
-        </w:rPr>
-      </w:pPr>
-      <w:r>
-        <w:rPr>
-          <w:rFonts w:ascii="Times" w:hAnsi="Times"/>
-          <w:color w:val="000000"/>
-          <w:sz w:val="27"/>
-          <w:szCs w:val="27"/>
-        </w:rPr>
         <w:t>5.</w:t>
       </w:r>
     </w:p>
@@ -571,6 +1740,46 @@
           <w:sz w:val="27"/>
           <w:szCs w:val="27"/>
         </w:rPr>
+        <w:t xml:space="preserve">python -m </w:t>
+      </w:r>
+      <w:proofErr w:type="spellStart"/>
+      <w:r>
+        <w:rPr>
+          <w:rFonts w:ascii="Times" w:hAnsi="Times"/>
+          <w:color w:val="000000"/>
+          <w:sz w:val="27"/>
+          <w:szCs w:val="27"/>
+        </w:rPr>
+        <w:t>unittest</w:t>
+      </w:r>
+      <w:proofErr w:type="spellEnd"/>
+      <w:r>
+        <w:rPr>
+          <w:rFonts w:ascii="Times" w:hAnsi="Times"/>
+          <w:color w:val="000000"/>
+          <w:sz w:val="27"/>
+          <w:szCs w:val="27"/>
+        </w:rPr>
+        <w:t xml:space="preserve"> discover -v tests/unit</w:t>
+      </w:r>
+    </w:p>
+    <w:p>
+      <w:pPr>
+        <w:pStyle w:val="NormalWeb"/>
+        <w:rPr>
+          <w:rFonts w:ascii="Times" w:hAnsi="Times"/>
+          <w:color w:val="000000"/>
+          <w:sz w:val="27"/>
+          <w:szCs w:val="27"/>
+        </w:rPr>
+      </w:pPr>
+      <w:r>
+        <w:rPr>
+          <w:rFonts w:ascii="Times" w:hAnsi="Times"/>
+          <w:color w:val="000000"/>
+          <w:sz w:val="27"/>
+          <w:szCs w:val="27"/>
+        </w:rPr>
         <w:t>Develop integration tests for the entire pipeline</w:t>
       </w:r>
     </w:p>
@@ -591,6 +1800,46 @@
           <w:sz w:val="27"/>
           <w:szCs w:val="27"/>
         </w:rPr>
+        <w:t xml:space="preserve">python -m </w:t>
+      </w:r>
+      <w:proofErr w:type="spellStart"/>
+      <w:r>
+        <w:rPr>
+          <w:rFonts w:ascii="Times" w:hAnsi="Times"/>
+          <w:color w:val="000000"/>
+          <w:sz w:val="27"/>
+          <w:szCs w:val="27"/>
+        </w:rPr>
+        <w:t>unittest</w:t>
+      </w:r>
+      <w:proofErr w:type="spellEnd"/>
+      <w:r>
+        <w:rPr>
+          <w:rFonts w:ascii="Times" w:hAnsi="Times"/>
+          <w:color w:val="000000"/>
+          <w:sz w:val="27"/>
+          <w:szCs w:val="27"/>
+        </w:rPr>
+        <w:t xml:space="preserve"> tests/integration/test_transactions_ingestion.py</w:t>
+      </w:r>
+    </w:p>
+    <w:p>
+      <w:pPr>
+        <w:pStyle w:val="NormalWeb"/>
+        <w:rPr>
+          <w:rFonts w:ascii="Times" w:hAnsi="Times"/>
+          <w:color w:val="000000"/>
+          <w:sz w:val="27"/>
+          <w:szCs w:val="27"/>
+        </w:rPr>
+      </w:pPr>
+      <w:r>
+        <w:rPr>
+          <w:rFonts w:ascii="Times" w:hAnsi="Times"/>
+          <w:color w:val="000000"/>
+          <w:sz w:val="27"/>
+          <w:szCs w:val="27"/>
+        </w:rPr>
         <w:t>Create system tests to ensure end-to-end functionality</w:t>
       </w:r>
     </w:p>
@@ -942,27 +2191,27 @@
           <w:sz w:val="27"/>
           <w:szCs w:val="27"/>
         </w:rPr>
+        <w:t>Set up a Jira board (or a similar tool) to track tasks and progress</w:t>
+      </w:r>
+    </w:p>
+    <w:p>
+      <w:pPr>
+        <w:pStyle w:val="NormalWeb"/>
+        <w:rPr>
+          <w:rFonts w:ascii="Times" w:hAnsi="Times"/>
+          <w:color w:val="000000"/>
+          <w:sz w:val="27"/>
+          <w:szCs w:val="27"/>
+        </w:rPr>
+      </w:pPr>
+      <w:r>
+        <w:rPr>
+          <w:rFonts w:ascii="Times" w:hAnsi="Times"/>
+          <w:color w:val="000000"/>
+          <w:sz w:val="27"/>
+          <w:szCs w:val="27"/>
+        </w:rPr>
         <w:lastRenderedPageBreak/>
-        <w:t>Set up a Jira board (or a similar tool) to track tasks and progress</w:t>
-      </w:r>
-    </w:p>
-    <w:p>
-      <w:pPr>
-        <w:pStyle w:val="NormalWeb"/>
-        <w:rPr>
-          <w:rFonts w:ascii="Times" w:hAnsi="Times"/>
-          <w:color w:val="000000"/>
-          <w:sz w:val="27"/>
-          <w:szCs w:val="27"/>
-        </w:rPr>
-      </w:pPr>
-      <w:r>
-        <w:rPr>
-          <w:rFonts w:ascii="Times" w:hAnsi="Times"/>
-          <w:color w:val="000000"/>
-          <w:sz w:val="27"/>
-          <w:szCs w:val="27"/>
-        </w:rPr>
         <w:t>Use Confluence (or a similar wiki) for project documentation</w:t>
       </w:r>
     </w:p>
@@ -1403,27 +2652,27 @@
           <w:sz w:val="27"/>
           <w:szCs w:val="27"/>
         </w:rPr>
+        <w:t>Understanding of data processing pipelines and analytics</w:t>
+      </w:r>
+    </w:p>
+    <w:p>
+      <w:pPr>
+        <w:pStyle w:val="NormalWeb"/>
+        <w:rPr>
+          <w:rFonts w:ascii="Times" w:hAnsi="Times"/>
+          <w:color w:val="000000"/>
+          <w:sz w:val="27"/>
+          <w:szCs w:val="27"/>
+        </w:rPr>
+      </w:pPr>
+      <w:r>
+        <w:rPr>
+          <w:rFonts w:ascii="Times" w:hAnsi="Times"/>
+          <w:color w:val="000000"/>
+          <w:sz w:val="27"/>
+          <w:szCs w:val="27"/>
+        </w:rPr>
         <w:lastRenderedPageBreak/>
-        <w:t>Understanding of data processing pipelines and analytics</w:t>
-      </w:r>
-    </w:p>
-    <w:p>
-      <w:pPr>
-        <w:pStyle w:val="NormalWeb"/>
-        <w:rPr>
-          <w:rFonts w:ascii="Times" w:hAnsi="Times"/>
-          <w:color w:val="000000"/>
-          <w:sz w:val="27"/>
-          <w:szCs w:val="27"/>
-        </w:rPr>
-      </w:pPr>
-      <w:r>
-        <w:rPr>
-          <w:rFonts w:ascii="Times" w:hAnsi="Times"/>
-          <w:color w:val="000000"/>
-          <w:sz w:val="27"/>
-          <w:szCs w:val="27"/>
-        </w:rPr>
         <w:t>Experience with testing at various levels</w:t>
       </w:r>
     </w:p>
@@ -2447,6 +3696,29 @@
       <w14:ligatures w14:val="none"/>
     </w:rPr>
   </w:style>
+  <w:style w:type="character" w:styleId="Hyperlink">
+    <w:name w:val="Hyperlink"/>
+    <w:basedOn w:val="DefaultParagraphFont"/>
+    <w:uiPriority w:val="99"/>
+    <w:unhideWhenUsed/>
+    <w:rsid w:val="008C04F3"/>
+    <w:rPr>
+      <w:color w:val="467886" w:themeColor="hyperlink"/>
+      <w:u w:val="single"/>
+    </w:rPr>
+  </w:style>
+  <w:style w:type="character" w:styleId="UnresolvedMention">
+    <w:name w:val="Unresolved Mention"/>
+    <w:basedOn w:val="DefaultParagraphFont"/>
+    <w:uiPriority w:val="99"/>
+    <w:semiHidden/>
+    <w:unhideWhenUsed/>
+    <w:rsid w:val="008C04F3"/>
+    <w:rPr>
+      <w:color w:val="605E5C"/>
+      <w:shd w:val="clear" w:color="auto" w:fill="E1DFDD"/>
+    </w:rPr>
+  </w:style>
 </w:styles>
 </file>
 

</xml_diff>

<commit_message>
Add dashboard components and fix integration pipeline tests
</commit_message>
<xml_diff>
--- a/docs/FDM Group Project Work JW.docx
+++ b/docs/FDM Group Project Work JW.docx
@@ -1297,6 +1297,317 @@
           <w:szCs w:val="27"/>
         </w:rPr>
       </w:pPr>
+      <w:r>
+        <w:rPr>
+          <w:rFonts w:ascii="Times" w:hAnsi="Times"/>
+          <w:color w:val="000000"/>
+          <w:sz w:val="27"/>
+          <w:szCs w:val="27"/>
+        </w:rPr>
+        <w:t>git status</w:t>
+      </w:r>
+    </w:p>
+    <w:p>
+      <w:pPr>
+        <w:pStyle w:val="NormalWeb"/>
+        <w:rPr>
+          <w:rFonts w:ascii="Times" w:hAnsi="Times"/>
+          <w:color w:val="000000"/>
+          <w:sz w:val="27"/>
+          <w:szCs w:val="27"/>
+        </w:rPr>
+      </w:pPr>
+      <w:r>
+        <w:rPr>
+          <w:rFonts w:ascii="Times" w:hAnsi="Times"/>
+          <w:color w:val="000000"/>
+          <w:sz w:val="27"/>
+          <w:szCs w:val="27"/>
+        </w:rPr>
+        <w:t>git add tests/unit/test_data_ingestion.py</w:t>
+      </w:r>
+    </w:p>
+    <w:p>
+      <w:pPr>
+        <w:pStyle w:val="NormalWeb"/>
+        <w:rPr>
+          <w:rFonts w:ascii="Times" w:hAnsi="Times"/>
+          <w:color w:val="000000"/>
+          <w:sz w:val="27"/>
+          <w:szCs w:val="27"/>
+        </w:rPr>
+      </w:pPr>
+      <w:r>
+        <w:rPr>
+          <w:rFonts w:ascii="Times" w:hAnsi="Times"/>
+          <w:color w:val="000000"/>
+          <w:sz w:val="27"/>
+          <w:szCs w:val="27"/>
+        </w:rPr>
+        <w:t>git commit -m " Finalize unit test coverage for Spark ingestion"</w:t>
+      </w:r>
+    </w:p>
+    <w:p>
+      <w:pPr>
+        <w:pStyle w:val="NormalWeb"/>
+        <w:rPr>
+          <w:rFonts w:ascii="Times" w:hAnsi="Times"/>
+          <w:color w:val="000000"/>
+          <w:sz w:val="27"/>
+          <w:szCs w:val="27"/>
+        </w:rPr>
+      </w:pPr>
+      <w:r>
+        <w:rPr>
+          <w:rFonts w:ascii="Times" w:hAnsi="Times"/>
+          <w:color w:val="000000"/>
+          <w:sz w:val="27"/>
+          <w:szCs w:val="27"/>
+        </w:rPr>
+        <w:t>git add tests/unit/test_data_ingestion.py</w:t>
+      </w:r>
+    </w:p>
+    <w:p>
+      <w:pPr>
+        <w:pStyle w:val="NormalWeb"/>
+        <w:rPr>
+          <w:rFonts w:ascii="Times" w:hAnsi="Times"/>
+          <w:color w:val="000000"/>
+          <w:sz w:val="27"/>
+          <w:szCs w:val="27"/>
+        </w:rPr>
+      </w:pPr>
+      <w:r>
+        <w:rPr>
+          <w:rFonts w:ascii="Times" w:hAnsi="Times"/>
+          <w:color w:val="000000"/>
+          <w:sz w:val="27"/>
+          <w:szCs w:val="27"/>
+        </w:rPr>
+        <w:t xml:space="preserve">git commit -m "Lint: Reformatted test_data_ingestion.py using black, </w:t>
+      </w:r>
+      <w:proofErr w:type="spellStart"/>
+      <w:r>
+        <w:rPr>
+          <w:rFonts w:ascii="Times" w:hAnsi="Times"/>
+          <w:color w:val="000000"/>
+          <w:sz w:val="27"/>
+          <w:szCs w:val="27"/>
+        </w:rPr>
+        <w:t>isort</w:t>
+      </w:r>
+      <w:proofErr w:type="spellEnd"/>
+      <w:r>
+        <w:rPr>
+          <w:rFonts w:ascii="Times" w:hAnsi="Times"/>
+          <w:color w:val="000000"/>
+          <w:sz w:val="27"/>
+          <w:szCs w:val="27"/>
+        </w:rPr>
+        <w:t>, flake8"</w:t>
+      </w:r>
+    </w:p>
+    <w:p>
+      <w:pPr>
+        <w:pStyle w:val="NormalWeb"/>
+        <w:rPr>
+          <w:rFonts w:ascii="Times" w:hAnsi="Times"/>
+          <w:color w:val="000000"/>
+          <w:sz w:val="27"/>
+          <w:szCs w:val="27"/>
+        </w:rPr>
+      </w:pPr>
+      <w:r>
+        <w:rPr>
+          <w:rFonts w:ascii="Times" w:hAnsi="Times"/>
+          <w:color w:val="000000"/>
+          <w:sz w:val="27"/>
+          <w:szCs w:val="27"/>
+        </w:rPr>
+        <w:t>git push origin dev</w:t>
+      </w:r>
+    </w:p>
+    <w:p>
+      <w:pPr>
+        <w:pStyle w:val="NormalWeb"/>
+        <w:rPr>
+          <w:rFonts w:ascii="Times" w:hAnsi="Times"/>
+          <w:color w:val="000000"/>
+          <w:sz w:val="27"/>
+          <w:szCs w:val="27"/>
+        </w:rPr>
+      </w:pPr>
+      <w:r>
+        <w:rPr>
+          <w:rFonts w:ascii="Times" w:hAnsi="Times"/>
+          <w:color w:val="000000"/>
+          <w:sz w:val="27"/>
+          <w:szCs w:val="27"/>
+        </w:rPr>
+        <w:t>git checkout -b feature/analytics-engine</w:t>
+      </w:r>
+    </w:p>
+    <w:p>
+      <w:pPr>
+        <w:pStyle w:val="NormalWeb"/>
+        <w:rPr>
+          <w:rFonts w:ascii="Times" w:hAnsi="Times"/>
+          <w:color w:val="000000"/>
+          <w:sz w:val="27"/>
+          <w:szCs w:val="27"/>
+        </w:rPr>
+      </w:pPr>
+      <w:r>
+        <w:rPr>
+          <w:rFonts w:ascii="Times" w:hAnsi="Times"/>
+          <w:color w:val="000000"/>
+          <w:sz w:val="27"/>
+          <w:szCs w:val="27"/>
+        </w:rPr>
+        <w:t>git add data_ingestion/pipeline.py</w:t>
+      </w:r>
+    </w:p>
+    <w:p>
+      <w:pPr>
+        <w:pStyle w:val="NormalWeb"/>
+        <w:rPr>
+          <w:rFonts w:ascii="Times" w:hAnsi="Times"/>
+          <w:color w:val="000000"/>
+          <w:sz w:val="27"/>
+          <w:szCs w:val="27"/>
+        </w:rPr>
+      </w:pPr>
+      <w:r>
+        <w:rPr>
+          <w:rFonts w:ascii="Times" w:hAnsi="Times"/>
+          <w:color w:val="000000"/>
+          <w:sz w:val="27"/>
+          <w:szCs w:val="27"/>
+        </w:rPr>
+        <w:t xml:space="preserve">git add </w:t>
+      </w:r>
+      <w:proofErr w:type="spellStart"/>
+      <w:r>
+        <w:rPr>
+          <w:rFonts w:ascii="Times" w:hAnsi="Times"/>
+          <w:color w:val="000000"/>
+          <w:sz w:val="27"/>
+          <w:szCs w:val="27"/>
+        </w:rPr>
+        <w:t>analytics_engine</w:t>
+      </w:r>
+      <w:proofErr w:type="spellEnd"/>
+      <w:r>
+        <w:rPr>
+          <w:rFonts w:ascii="Times" w:hAnsi="Times"/>
+          <w:color w:val="000000"/>
+          <w:sz w:val="27"/>
+          <w:szCs w:val="27"/>
+        </w:rPr>
+        <w:t>/</w:t>
+      </w:r>
+    </w:p>
+    <w:p>
+      <w:pPr>
+        <w:pStyle w:val="NormalWeb"/>
+        <w:rPr>
+          <w:rFonts w:ascii="Times" w:hAnsi="Times"/>
+          <w:color w:val="000000"/>
+          <w:sz w:val="27"/>
+          <w:szCs w:val="27"/>
+        </w:rPr>
+      </w:pPr>
+      <w:r>
+        <w:rPr>
+          <w:rFonts w:ascii="Times" w:hAnsi="Times"/>
+          <w:color w:val="000000"/>
+          <w:sz w:val="27"/>
+          <w:szCs w:val="27"/>
+        </w:rPr>
+        <w:t>git add tests/integration/test_ingestion_to_engine.py</w:t>
+      </w:r>
+    </w:p>
+    <w:p>
+      <w:pPr>
+        <w:pStyle w:val="NormalWeb"/>
+        <w:rPr>
+          <w:rFonts w:ascii="Times" w:hAnsi="Times"/>
+          <w:color w:val="000000"/>
+          <w:sz w:val="27"/>
+          <w:szCs w:val="27"/>
+        </w:rPr>
+      </w:pPr>
+      <w:r>
+        <w:rPr>
+          <w:rFonts w:ascii="Times" w:hAnsi="Times"/>
+          <w:color w:val="000000"/>
+          <w:sz w:val="27"/>
+          <w:szCs w:val="27"/>
+        </w:rPr>
+        <w:t>git add tests/integration/test_integration_pipeline.py</w:t>
+      </w:r>
+    </w:p>
+    <w:p>
+      <w:pPr>
+        <w:pStyle w:val="NormalWeb"/>
+        <w:rPr>
+          <w:rFonts w:ascii="Times" w:hAnsi="Times"/>
+          <w:color w:val="000000"/>
+          <w:sz w:val="27"/>
+          <w:szCs w:val="27"/>
+        </w:rPr>
+      </w:pPr>
+      <w:r>
+        <w:rPr>
+          <w:rFonts w:ascii="Times" w:hAnsi="Times"/>
+          <w:color w:val="000000"/>
+          <w:sz w:val="27"/>
+          <w:szCs w:val="27"/>
+        </w:rPr>
+        <w:t>git add tests/unit/test_engine_core.py</w:t>
+      </w:r>
+    </w:p>
+    <w:p>
+      <w:pPr>
+        <w:pStyle w:val="NormalWeb"/>
+        <w:rPr>
+          <w:rFonts w:ascii="Times" w:hAnsi="Times"/>
+          <w:color w:val="000000"/>
+          <w:sz w:val="27"/>
+          <w:szCs w:val="27"/>
+        </w:rPr>
+      </w:pPr>
+      <w:r>
+        <w:rPr>
+          <w:rFonts w:ascii="Times" w:hAnsi="Times"/>
+          <w:color w:val="000000"/>
+          <w:sz w:val="27"/>
+          <w:szCs w:val="27"/>
+        </w:rPr>
+        <w:t>git commit -m " Finalize analytics engine test suite with formatting and linting fixes"</w:t>
+      </w:r>
+    </w:p>
+    <w:p>
+      <w:pPr>
+        <w:pStyle w:val="NormalWeb"/>
+        <w:rPr>
+          <w:rFonts w:ascii="Times" w:hAnsi="Times"/>
+          <w:color w:val="000000"/>
+          <w:sz w:val="27"/>
+          <w:szCs w:val="27"/>
+        </w:rPr>
+      </w:pPr>
+    </w:p>
+    <w:p>
+      <w:pPr>
+        <w:pStyle w:val="NormalWeb"/>
+        <w:rPr>
+          <w:rFonts w:ascii="Times" w:hAnsi="Times"/>
+          <w:color w:val="000000"/>
+          <w:sz w:val="27"/>
+          <w:szCs w:val="27"/>
+        </w:rPr>
+      </w:pPr>
     </w:p>
     <w:p>
       <w:pPr>
@@ -1388,6 +1699,7 @@
           <w:sz w:val="27"/>
           <w:szCs w:val="27"/>
         </w:rPr>
+        <w:lastRenderedPageBreak/>
         <w:t>Analytics Engine:</w:t>
       </w:r>
     </w:p>
@@ -1679,7 +1991,898 @@
           <w:sz w:val="27"/>
           <w:szCs w:val="27"/>
         </w:rPr>
+        <w:t>5.</w:t>
+      </w:r>
+    </w:p>
+    <w:p>
+      <w:pPr>
+        <w:pStyle w:val="NormalWeb"/>
+        <w:rPr>
+          <w:rFonts w:ascii="Times" w:hAnsi="Times"/>
+          <w:color w:val="000000"/>
+          <w:sz w:val="27"/>
+          <w:szCs w:val="27"/>
+        </w:rPr>
+      </w:pPr>
+      <w:r>
+        <w:rPr>
+          <w:rFonts w:ascii="Times" w:hAnsi="Times"/>
+          <w:color w:val="000000"/>
+          <w:sz w:val="27"/>
+          <w:szCs w:val="27"/>
+        </w:rPr>
+        <w:t>Testing Suite:</w:t>
+      </w:r>
+    </w:p>
+    <w:p>
+      <w:pPr>
+        <w:pStyle w:val="NormalWeb"/>
+        <w:rPr>
+          <w:rFonts w:ascii="Times" w:hAnsi="Times"/>
+          <w:color w:val="000000"/>
+          <w:sz w:val="27"/>
+          <w:szCs w:val="27"/>
+        </w:rPr>
+      </w:pPr>
+      <w:r>
+        <w:rPr>
+          <w:rFonts w:ascii="Times" w:hAnsi="Times"/>
+          <w:color w:val="000000"/>
+          <w:sz w:val="27"/>
+          <w:szCs w:val="27"/>
+        </w:rPr>
+        <w:t>Implement comprehensive unit tests for all modules</w:t>
+      </w:r>
+    </w:p>
+    <w:p>
+      <w:pPr>
+        <w:pStyle w:val="NormalWeb"/>
+        <w:rPr>
+          <w:rFonts w:ascii="Times" w:hAnsi="Times"/>
+          <w:color w:val="000000"/>
+          <w:sz w:val="27"/>
+          <w:szCs w:val="27"/>
+          <w:highlight w:val="yellow"/>
+        </w:rPr>
+      </w:pPr>
+      <w:r>
+        <w:rPr>
+          <w:rFonts w:ascii="Times" w:hAnsi="Times"/>
+          <w:color w:val="000000"/>
+          <w:sz w:val="27"/>
+          <w:szCs w:val="27"/>
+          <w:highlight w:val="yellow"/>
+        </w:rPr>
+        <w:t xml:space="preserve">PYTHONPATH=. </w:t>
+      </w:r>
+      <w:proofErr w:type="spellStart"/>
+      <w:r>
+        <w:rPr>
+          <w:rFonts w:ascii="Times" w:hAnsi="Times"/>
+          <w:color w:val="000000"/>
+          <w:sz w:val="27"/>
+          <w:szCs w:val="27"/>
+          <w:highlight w:val="yellow"/>
+        </w:rPr>
+        <w:t>pytest</w:t>
+      </w:r>
+      <w:proofErr w:type="spellEnd"/>
+      <w:r>
+        <w:rPr>
+          <w:rFonts w:ascii="Times" w:hAnsi="Times"/>
+          <w:color w:val="000000"/>
+          <w:sz w:val="27"/>
+          <w:szCs w:val="27"/>
+          <w:highlight w:val="yellow"/>
+        </w:rPr>
+        <w:t xml:space="preserve"> tests/</w:t>
+      </w:r>
+      <w:r>
+        <w:rPr>
+          <w:rFonts w:ascii="Times" w:hAnsi="Times"/>
+          <w:color w:val="000000"/>
+          <w:sz w:val="27"/>
+          <w:szCs w:val="27"/>
+          <w:highlight w:val="yellow"/>
+        </w:rPr>
+        <w:t>unit</w:t>
+      </w:r>
+    </w:p>
+    <w:p>
+      <w:pPr>
+        <w:pStyle w:val="NormalWeb"/>
+        <w:rPr>
+          <w:rFonts w:ascii="Times" w:hAnsi="Times"/>
+          <w:color w:val="000000"/>
+          <w:sz w:val="27"/>
+          <w:szCs w:val="27"/>
+        </w:rPr>
+      </w:pPr>
+      <w:r>
+        <w:rPr>
+          <w:rFonts w:ascii="Times" w:hAnsi="Times"/>
+          <w:color w:val="000000"/>
+          <w:sz w:val="27"/>
+          <w:szCs w:val="27"/>
+          <w:highlight w:val="yellow"/>
+        </w:rPr>
+        <w:t xml:space="preserve">PYTHONPATH=. </w:t>
+      </w:r>
+      <w:proofErr w:type="spellStart"/>
+      <w:r>
+        <w:rPr>
+          <w:rFonts w:ascii="Times" w:hAnsi="Times"/>
+          <w:color w:val="000000"/>
+          <w:sz w:val="27"/>
+          <w:szCs w:val="27"/>
+          <w:highlight w:val="yellow"/>
+        </w:rPr>
+        <w:t>pytest</w:t>
+      </w:r>
+      <w:proofErr w:type="spellEnd"/>
+      <w:r>
+        <w:rPr>
+          <w:rFonts w:ascii="Times" w:hAnsi="Times"/>
+          <w:color w:val="000000"/>
+          <w:sz w:val="27"/>
+          <w:szCs w:val="27"/>
+          <w:highlight w:val="yellow"/>
+        </w:rPr>
+        <w:t xml:space="preserve"> tests/integration</w:t>
+      </w:r>
+    </w:p>
+    <w:p>
+      <w:pPr>
+        <w:pStyle w:val="NormalWeb"/>
+        <w:rPr>
+          <w:rFonts w:ascii="Times" w:hAnsi="Times"/>
+          <w:color w:val="000000"/>
+          <w:sz w:val="27"/>
+          <w:szCs w:val="27"/>
+        </w:rPr>
+      </w:pPr>
+      <w:r>
+        <w:rPr>
+          <w:rFonts w:ascii="Times" w:hAnsi="Times"/>
+          <w:color w:val="000000"/>
+          <w:sz w:val="27"/>
+          <w:szCs w:val="27"/>
+        </w:rPr>
+        <w:t>Develop integration tests for the entire pipeline</w:t>
+      </w:r>
+    </w:p>
+    <w:p>
+      <w:pPr>
+        <w:pStyle w:val="NormalWeb"/>
+        <w:rPr>
+          <w:rFonts w:ascii="Times" w:hAnsi="Times"/>
+          <w:color w:val="000000"/>
+          <w:sz w:val="27"/>
+          <w:szCs w:val="27"/>
+        </w:rPr>
+      </w:pPr>
+      <w:r>
+        <w:rPr>
+          <w:rFonts w:ascii="Times" w:hAnsi="Times"/>
+          <w:color w:val="000000"/>
+          <w:sz w:val="27"/>
+          <w:szCs w:val="27"/>
+        </w:rPr>
+        <w:t>Create system tests to ensure end-to-end functionality</w:t>
+      </w:r>
+    </w:p>
+    <w:p>
+      <w:pPr>
+        <w:pStyle w:val="NormalWeb"/>
+        <w:rPr>
+          <w:rFonts w:ascii="Times" w:hAnsi="Times"/>
+          <w:color w:val="000000"/>
+          <w:sz w:val="27"/>
+          <w:szCs w:val="27"/>
+        </w:rPr>
+      </w:pPr>
+      <w:r>
+        <w:rPr>
+          <w:rFonts w:ascii="Times" w:hAnsi="Times"/>
+          <w:color w:val="000000"/>
+          <w:sz w:val="27"/>
+          <w:szCs w:val="27"/>
+        </w:rPr>
+        <w:t>6.</w:t>
+      </w:r>
+    </w:p>
+    <w:p>
+      <w:pPr>
+        <w:pStyle w:val="NormalWeb"/>
+        <w:rPr>
+          <w:rFonts w:ascii="Times" w:hAnsi="Times"/>
+          <w:color w:val="000000"/>
+          <w:sz w:val="27"/>
+          <w:szCs w:val="27"/>
+        </w:rPr>
+      </w:pPr>
+      <w:r>
+        <w:rPr>
+          <w:rFonts w:ascii="Times" w:hAnsi="Times"/>
+          <w:color w:val="000000"/>
+          <w:sz w:val="27"/>
+          <w:szCs w:val="27"/>
+        </w:rPr>
+        <w:t>CI/CD Pipeline:</w:t>
+      </w:r>
+    </w:p>
+    <w:p>
+      <w:pPr>
+        <w:pStyle w:val="NormalWeb"/>
+        <w:rPr>
+          <w:rFonts w:ascii="Times" w:hAnsi="Times"/>
+          <w:color w:val="000000"/>
+          <w:sz w:val="27"/>
+          <w:szCs w:val="27"/>
+        </w:rPr>
+      </w:pPr>
+      <w:r>
+        <w:rPr>
+          <w:rFonts w:ascii="Times" w:hAnsi="Times"/>
+          <w:color w:val="000000"/>
+          <w:sz w:val="27"/>
+          <w:szCs w:val="27"/>
+        </w:rPr>
         <w:lastRenderedPageBreak/>
+        <w:t>Set up a GitHub repository with proper branching strategy</w:t>
+      </w:r>
+    </w:p>
+    <w:p>
+      <w:pPr>
+        <w:pStyle w:val="NormalWeb"/>
+        <w:rPr>
+          <w:rFonts w:ascii="Times" w:hAnsi="Times"/>
+          <w:color w:val="000000"/>
+          <w:sz w:val="27"/>
+          <w:szCs w:val="27"/>
+        </w:rPr>
+      </w:pPr>
+      <w:r>
+        <w:rPr>
+          <w:rFonts w:ascii="Times" w:hAnsi="Times"/>
+          <w:color w:val="000000"/>
+          <w:sz w:val="27"/>
+          <w:szCs w:val="27"/>
+        </w:rPr>
+        <w:t>Implement a CI/CD pipeline using GitHub Actions</w:t>
+      </w:r>
+    </w:p>
+    <w:p>
+      <w:pPr>
+        <w:pStyle w:val="NormalWeb"/>
+        <w:rPr>
+          <w:rFonts w:ascii="Times" w:hAnsi="Times"/>
+          <w:color w:val="000000"/>
+          <w:sz w:val="27"/>
+          <w:szCs w:val="27"/>
+        </w:rPr>
+      </w:pPr>
+      <w:r>
+        <w:rPr>
+          <w:rFonts w:ascii="Times" w:hAnsi="Times"/>
+          <w:color w:val="000000"/>
+          <w:sz w:val="27"/>
+          <w:szCs w:val="27"/>
+        </w:rPr>
+        <w:t>Include automated testing, linting, and deployment stages</w:t>
+      </w:r>
+    </w:p>
+    <w:p>
+      <w:pPr>
+        <w:pStyle w:val="NormalWeb"/>
+        <w:rPr>
+          <w:rFonts w:ascii="Times" w:hAnsi="Times"/>
+          <w:color w:val="000000"/>
+          <w:sz w:val="27"/>
+          <w:szCs w:val="27"/>
+        </w:rPr>
+      </w:pPr>
+      <w:r>
+        <w:rPr>
+          <w:rFonts w:ascii="Times" w:hAnsi="Times"/>
+          <w:color w:val="000000"/>
+          <w:sz w:val="27"/>
+          <w:szCs w:val="27"/>
+        </w:rPr>
+        <w:t>7.</w:t>
+      </w:r>
+    </w:p>
+    <w:p>
+      <w:pPr>
+        <w:pStyle w:val="NormalWeb"/>
+        <w:rPr>
+          <w:rFonts w:ascii="Times" w:hAnsi="Times"/>
+          <w:color w:val="000000"/>
+          <w:sz w:val="27"/>
+          <w:szCs w:val="27"/>
+        </w:rPr>
+      </w:pPr>
+      <w:r>
+        <w:rPr>
+          <w:rFonts w:ascii="Times" w:hAnsi="Times"/>
+          <w:color w:val="000000"/>
+          <w:sz w:val="27"/>
+          <w:szCs w:val="27"/>
+        </w:rPr>
+        <w:t>Documentation and Code Quality:</w:t>
+      </w:r>
+    </w:p>
+    <w:p>
+      <w:pPr>
+        <w:pStyle w:val="NormalWeb"/>
+        <w:rPr>
+          <w:rFonts w:ascii="Times" w:hAnsi="Times"/>
+          <w:color w:val="000000"/>
+          <w:sz w:val="27"/>
+          <w:szCs w:val="27"/>
+        </w:rPr>
+      </w:pPr>
+      <w:r>
+        <w:rPr>
+          <w:rFonts w:ascii="Times" w:hAnsi="Times"/>
+          <w:color w:val="000000"/>
+          <w:sz w:val="27"/>
+          <w:szCs w:val="27"/>
+        </w:rPr>
+        <w:t>Write clear and comprehensive documentation for the project</w:t>
+      </w:r>
+    </w:p>
+    <w:p>
+      <w:pPr>
+        <w:pStyle w:val="NormalWeb"/>
+        <w:rPr>
+          <w:rFonts w:ascii="Times" w:hAnsi="Times"/>
+          <w:color w:val="000000"/>
+          <w:sz w:val="27"/>
+          <w:szCs w:val="27"/>
+        </w:rPr>
+      </w:pPr>
+      <w:r>
+        <w:rPr>
+          <w:rFonts w:ascii="Times" w:hAnsi="Times"/>
+          <w:color w:val="000000"/>
+          <w:sz w:val="27"/>
+          <w:szCs w:val="27"/>
+        </w:rPr>
+        <w:t>Implement proper logging and error handling</w:t>
+      </w:r>
+    </w:p>
+    <w:p>
+      <w:pPr>
+        <w:pStyle w:val="NormalWeb"/>
+        <w:rPr>
+          <w:rFonts w:ascii="Times" w:hAnsi="Times"/>
+          <w:color w:val="000000"/>
+          <w:sz w:val="27"/>
+          <w:szCs w:val="27"/>
+        </w:rPr>
+      </w:pPr>
+      <w:r>
+        <w:rPr>
+          <w:rFonts w:ascii="Times" w:hAnsi="Times"/>
+          <w:color w:val="000000"/>
+          <w:sz w:val="27"/>
+          <w:szCs w:val="27"/>
+        </w:rPr>
+        <w:t>Follow PEP 8 style guide and use type hints</w:t>
+      </w:r>
+    </w:p>
+    <w:p>
+      <w:pPr>
+        <w:pStyle w:val="NormalWeb"/>
+        <w:rPr>
+          <w:rFonts w:ascii="Times" w:hAnsi="Times"/>
+          <w:color w:val="000000"/>
+          <w:sz w:val="27"/>
+          <w:szCs w:val="27"/>
+        </w:rPr>
+      </w:pPr>
+      <w:proofErr w:type="gramStart"/>
+      <w:r>
+        <w:rPr>
+          <w:rFonts w:ascii="Times" w:hAnsi="Times"/>
+          <w:color w:val="000000"/>
+          <w:sz w:val="27"/>
+          <w:szCs w:val="27"/>
+          <w:highlight w:val="yellow"/>
+        </w:rPr>
+        <w:t>.Flake</w:t>
+      </w:r>
+      <w:proofErr w:type="gramEnd"/>
+      <w:r>
+        <w:rPr>
+          <w:rFonts w:ascii="Times" w:hAnsi="Times"/>
+          <w:color w:val="000000"/>
+          <w:sz w:val="27"/>
+          <w:szCs w:val="27"/>
+          <w:highlight w:val="yellow"/>
+        </w:rPr>
+        <w:t>8 used in CI YAML file for this</w:t>
+      </w:r>
+      <w:r>
+        <w:rPr>
+          <w:rFonts w:ascii="Times" w:hAnsi="Times"/>
+          <w:color w:val="000000"/>
+          <w:sz w:val="27"/>
+          <w:szCs w:val="27"/>
+        </w:rPr>
+        <w:t xml:space="preserve"> </w:t>
+      </w:r>
+    </w:p>
+    <w:p>
+      <w:pPr>
+        <w:pStyle w:val="NormalWeb"/>
+        <w:rPr>
+          <w:rFonts w:ascii="Times" w:hAnsi="Times"/>
+          <w:color w:val="000000"/>
+          <w:sz w:val="27"/>
+          <w:szCs w:val="27"/>
+        </w:rPr>
+      </w:pPr>
+      <w:r>
+        <w:rPr>
+          <w:rFonts w:ascii="Times" w:hAnsi="Times"/>
+          <w:color w:val="000000"/>
+          <w:sz w:val="27"/>
+          <w:szCs w:val="27"/>
+        </w:rPr>
+        <w:t>8.</w:t>
+      </w:r>
+    </w:p>
+    <w:p>
+      <w:pPr>
+        <w:pStyle w:val="NormalWeb"/>
+        <w:rPr>
+          <w:rFonts w:ascii="Times" w:hAnsi="Times"/>
+          <w:color w:val="000000"/>
+          <w:sz w:val="27"/>
+          <w:szCs w:val="27"/>
+        </w:rPr>
+      </w:pPr>
+      <w:r>
+        <w:rPr>
+          <w:rFonts w:ascii="Times" w:hAnsi="Times"/>
+          <w:color w:val="000000"/>
+          <w:sz w:val="27"/>
+          <w:szCs w:val="27"/>
+        </w:rPr>
+        <w:t>Containerization:</w:t>
+      </w:r>
+    </w:p>
+    <w:p>
+      <w:pPr>
+        <w:pStyle w:val="NormalWeb"/>
+        <w:rPr>
+          <w:rFonts w:ascii="Times" w:hAnsi="Times"/>
+          <w:color w:val="000000"/>
+          <w:sz w:val="27"/>
+          <w:szCs w:val="27"/>
+        </w:rPr>
+      </w:pPr>
+      <w:proofErr w:type="spellStart"/>
+      <w:r>
+        <w:rPr>
+          <w:rFonts w:ascii="Times" w:hAnsi="Times"/>
+          <w:color w:val="000000"/>
+          <w:sz w:val="27"/>
+          <w:szCs w:val="27"/>
+        </w:rPr>
+        <w:t>Dockerize</w:t>
+      </w:r>
+      <w:proofErr w:type="spellEnd"/>
+      <w:r>
+        <w:rPr>
+          <w:rFonts w:ascii="Times" w:hAnsi="Times"/>
+          <w:color w:val="000000"/>
+          <w:sz w:val="27"/>
+          <w:szCs w:val="27"/>
+        </w:rPr>
+        <w:t xml:space="preserve"> the application for easy deployment</w:t>
+      </w:r>
+    </w:p>
+    <w:p>
+      <w:pPr>
+        <w:pStyle w:val="NormalWeb"/>
+        <w:rPr>
+          <w:rFonts w:ascii="Times" w:hAnsi="Times"/>
+          <w:color w:val="000000"/>
+          <w:sz w:val="27"/>
+          <w:szCs w:val="27"/>
+        </w:rPr>
+      </w:pPr>
+      <w:r>
+        <w:rPr>
+          <w:rFonts w:ascii="Times" w:hAnsi="Times"/>
+          <w:color w:val="000000"/>
+          <w:sz w:val="27"/>
+          <w:szCs w:val="27"/>
+        </w:rPr>
+        <w:t>Create docker-compose file for local development and testing</w:t>
+      </w:r>
+    </w:p>
+    <w:p>
+      <w:pPr>
+        <w:pStyle w:val="NormalWeb"/>
+        <w:rPr>
+          <w:rFonts w:ascii="Times" w:hAnsi="Times"/>
+          <w:color w:val="000000"/>
+          <w:sz w:val="27"/>
+          <w:szCs w:val="27"/>
+        </w:rPr>
+      </w:pPr>
+      <w:r>
+        <w:rPr>
+          <w:rFonts w:ascii="Times" w:hAnsi="Times"/>
+          <w:color w:val="000000"/>
+          <w:sz w:val="27"/>
+          <w:szCs w:val="27"/>
+        </w:rPr>
+        <w:t>9.</w:t>
+      </w:r>
+    </w:p>
+    <w:p>
+      <w:pPr>
+        <w:pStyle w:val="NormalWeb"/>
+        <w:rPr>
+          <w:rFonts w:ascii="Times" w:hAnsi="Times"/>
+          <w:color w:val="000000"/>
+          <w:sz w:val="27"/>
+          <w:szCs w:val="27"/>
+        </w:rPr>
+      </w:pPr>
+      <w:r>
+        <w:rPr>
+          <w:rFonts w:ascii="Times" w:hAnsi="Times"/>
+          <w:color w:val="000000"/>
+          <w:sz w:val="27"/>
+          <w:szCs w:val="27"/>
+        </w:rPr>
+        <w:t>Project Management:</w:t>
+      </w:r>
+    </w:p>
+    <w:p>
+      <w:pPr>
+        <w:pStyle w:val="NormalWeb"/>
+        <w:rPr>
+          <w:rFonts w:ascii="Times" w:hAnsi="Times"/>
+          <w:color w:val="000000"/>
+          <w:sz w:val="27"/>
+          <w:szCs w:val="27"/>
+        </w:rPr>
+      </w:pPr>
+      <w:r>
+        <w:rPr>
+          <w:rFonts w:ascii="Times" w:hAnsi="Times"/>
+          <w:color w:val="000000"/>
+          <w:sz w:val="27"/>
+          <w:szCs w:val="27"/>
+        </w:rPr>
+        <w:t>Set up a Jira board (or a similar tool) to track tasks and progress</w:t>
+      </w:r>
+    </w:p>
+    <w:p>
+      <w:pPr>
+        <w:pStyle w:val="NormalWeb"/>
+        <w:rPr>
+          <w:rFonts w:ascii="Times" w:hAnsi="Times"/>
+          <w:color w:val="000000"/>
+          <w:sz w:val="27"/>
+          <w:szCs w:val="27"/>
+        </w:rPr>
+      </w:pPr>
+      <w:r>
+        <w:rPr>
+          <w:rFonts w:ascii="Times" w:hAnsi="Times"/>
+          <w:color w:val="000000"/>
+          <w:sz w:val="27"/>
+          <w:szCs w:val="27"/>
+        </w:rPr>
+        <w:t>Use Confluence (or a similar wiki) for project documentation</w:t>
+      </w:r>
+    </w:p>
+    <w:p>
+      <w:pPr>
+        <w:pStyle w:val="NormalWeb"/>
+        <w:rPr>
+          <w:rFonts w:ascii="Times" w:hAnsi="Times"/>
+          <w:color w:val="000000"/>
+          <w:sz w:val="27"/>
+          <w:szCs w:val="27"/>
+        </w:rPr>
+      </w:pPr>
+      <w:r>
+        <w:rPr>
+          <w:rFonts w:ascii="Times" w:hAnsi="Times"/>
+          <w:color w:val="000000"/>
+          <w:sz w:val="27"/>
+          <w:szCs w:val="27"/>
+        </w:rPr>
+        <w:t>10.</w:t>
+      </w:r>
+    </w:p>
+    <w:p>
+      <w:pPr>
+        <w:pStyle w:val="NormalWeb"/>
+        <w:rPr>
+          <w:rFonts w:ascii="Times" w:hAnsi="Times"/>
+          <w:color w:val="000000"/>
+          <w:sz w:val="27"/>
+          <w:szCs w:val="27"/>
+        </w:rPr>
+      </w:pPr>
+      <w:r>
+        <w:rPr>
+          <w:rFonts w:ascii="Times" w:hAnsi="Times"/>
+          <w:color w:val="000000"/>
+          <w:sz w:val="27"/>
+          <w:szCs w:val="27"/>
+        </w:rPr>
+        <w:t>Bonus Features:</w:t>
+      </w:r>
+    </w:p>
+    <w:p>
+      <w:pPr>
+        <w:pStyle w:val="NormalWeb"/>
+        <w:rPr>
+          <w:rFonts w:ascii="Times" w:hAnsi="Times"/>
+          <w:color w:val="000000"/>
+          <w:sz w:val="27"/>
+          <w:szCs w:val="27"/>
+        </w:rPr>
+      </w:pPr>
+      <w:r>
+        <w:rPr>
+          <w:rFonts w:ascii="Times" w:hAnsi="Times"/>
+          <w:color w:val="000000"/>
+          <w:sz w:val="27"/>
+          <w:szCs w:val="27"/>
+        </w:rPr>
+        <w:t>Implement data versioning using a tool like DVC (Data Version Control)</w:t>
+      </w:r>
+    </w:p>
+    <w:p>
+      <w:pPr>
+        <w:pStyle w:val="NormalWeb"/>
+        <w:rPr>
+          <w:rFonts w:ascii="Times" w:hAnsi="Times"/>
+          <w:color w:val="000000"/>
+          <w:sz w:val="27"/>
+          <w:szCs w:val="27"/>
+        </w:rPr>
+      </w:pPr>
+      <w:r>
+        <w:rPr>
+          <w:rFonts w:ascii="Times" w:hAnsi="Times"/>
+          <w:color w:val="000000"/>
+          <w:sz w:val="27"/>
+          <w:szCs w:val="27"/>
+        </w:rPr>
+        <w:t>Add a feature for exporting reports in various formats (PDF, Excel)</w:t>
+      </w:r>
+    </w:p>
+    <w:p>
+      <w:pPr>
+        <w:pStyle w:val="NormalWeb"/>
+        <w:rPr>
+          <w:rFonts w:ascii="Times" w:hAnsi="Times"/>
+          <w:color w:val="000000"/>
+          <w:sz w:val="27"/>
+          <w:szCs w:val="27"/>
+        </w:rPr>
+      </w:pPr>
+      <w:r>
+        <w:rPr>
+          <w:rFonts w:ascii="Times" w:hAnsi="Times"/>
+          <w:color w:val="000000"/>
+          <w:sz w:val="27"/>
+          <w:szCs w:val="27"/>
+        </w:rPr>
+        <w:t>Implement role-based access control for the dashboard</w:t>
+      </w:r>
+    </w:p>
+    <w:p>
+      <w:pPr>
+        <w:pStyle w:val="NormalWeb"/>
+        <w:rPr>
+          <w:rFonts w:ascii="Times" w:hAnsi="Times"/>
+          <w:color w:val="000000"/>
+          <w:sz w:val="27"/>
+          <w:szCs w:val="27"/>
+        </w:rPr>
+      </w:pPr>
+      <w:r>
+        <w:rPr>
+          <w:rFonts w:ascii="Times" w:hAnsi="Times"/>
+          <w:color w:val="000000"/>
+          <w:sz w:val="27"/>
+          <w:szCs w:val="27"/>
+        </w:rPr>
+        <w:t>Development Approach:</w:t>
+      </w:r>
+    </w:p>
+    <w:p>
+      <w:pPr>
+        <w:pStyle w:val="NormalWeb"/>
+        <w:rPr>
+          <w:rFonts w:ascii="Times" w:hAnsi="Times"/>
+          <w:color w:val="000000"/>
+          <w:sz w:val="27"/>
+          <w:szCs w:val="27"/>
+        </w:rPr>
+      </w:pPr>
+      <w:r>
+        <w:rPr>
+          <w:rFonts w:ascii="Times" w:hAnsi="Times"/>
+          <w:color w:val="000000"/>
+          <w:sz w:val="27"/>
+          <w:szCs w:val="27"/>
+        </w:rPr>
+        <w:t>1.</w:t>
+      </w:r>
+    </w:p>
+    <w:p>
+      <w:pPr>
+        <w:pStyle w:val="NormalWeb"/>
+        <w:rPr>
+          <w:rFonts w:ascii="Times" w:hAnsi="Times"/>
+          <w:color w:val="000000"/>
+          <w:sz w:val="27"/>
+          <w:szCs w:val="27"/>
+        </w:rPr>
+      </w:pPr>
+      <w:r>
+        <w:rPr>
+          <w:rFonts w:ascii="Times" w:hAnsi="Times"/>
+          <w:color w:val="000000"/>
+          <w:sz w:val="27"/>
+          <w:szCs w:val="27"/>
+        </w:rPr>
+        <w:lastRenderedPageBreak/>
+        <w:t>Start by setting up the project structure and GitHub repository</w:t>
+      </w:r>
+    </w:p>
+    <w:p>
+      <w:pPr>
+        <w:pStyle w:val="NormalWeb"/>
+        <w:rPr>
+          <w:rFonts w:ascii="Times" w:hAnsi="Times"/>
+          <w:color w:val="000000"/>
+          <w:sz w:val="27"/>
+          <w:szCs w:val="27"/>
+        </w:rPr>
+      </w:pPr>
+      <w:r>
+        <w:rPr>
+          <w:rFonts w:ascii="Times" w:hAnsi="Times"/>
+          <w:color w:val="000000"/>
+          <w:sz w:val="27"/>
+          <w:szCs w:val="27"/>
+        </w:rPr>
+        <w:t>2.</w:t>
+      </w:r>
+    </w:p>
+    <w:p>
+      <w:pPr>
+        <w:pStyle w:val="NormalWeb"/>
+        <w:rPr>
+          <w:rFonts w:ascii="Times" w:hAnsi="Times"/>
+          <w:color w:val="000000"/>
+          <w:sz w:val="27"/>
+          <w:szCs w:val="27"/>
+        </w:rPr>
+      </w:pPr>
+      <w:r>
+        <w:rPr>
+          <w:rFonts w:ascii="Times" w:hAnsi="Times"/>
+          <w:color w:val="000000"/>
+          <w:sz w:val="27"/>
+          <w:szCs w:val="27"/>
+        </w:rPr>
+        <w:t>Implement the core data processing functionality using TDD (Test-Driven Development)</w:t>
+      </w:r>
+    </w:p>
+    <w:p>
+      <w:pPr>
+        <w:pStyle w:val="NormalWeb"/>
+        <w:rPr>
+          <w:rFonts w:ascii="Times" w:hAnsi="Times"/>
+          <w:color w:val="000000"/>
+          <w:sz w:val="27"/>
+          <w:szCs w:val="27"/>
+        </w:rPr>
+      </w:pPr>
+      <w:r>
+        <w:rPr>
+          <w:rFonts w:ascii="Times" w:hAnsi="Times"/>
+          <w:color w:val="000000"/>
+          <w:sz w:val="27"/>
+          <w:szCs w:val="27"/>
+        </w:rPr>
+        <w:t>3.</w:t>
+      </w:r>
+    </w:p>
+    <w:p>
+      <w:pPr>
+        <w:pStyle w:val="NormalWeb"/>
+        <w:rPr>
+          <w:rFonts w:ascii="Times" w:hAnsi="Times"/>
+          <w:color w:val="000000"/>
+          <w:sz w:val="27"/>
+          <w:szCs w:val="27"/>
+        </w:rPr>
+      </w:pPr>
+      <w:r>
+        <w:rPr>
+          <w:rFonts w:ascii="Times" w:hAnsi="Times"/>
+          <w:color w:val="000000"/>
+          <w:sz w:val="27"/>
+          <w:szCs w:val="27"/>
+        </w:rPr>
+        <w:t>Develop the analytics engine and dashboard iteratively</w:t>
+      </w:r>
+    </w:p>
+    <w:p>
+      <w:pPr>
+        <w:pStyle w:val="NormalWeb"/>
+        <w:rPr>
+          <w:rFonts w:ascii="Times" w:hAnsi="Times"/>
+          <w:color w:val="000000"/>
+          <w:sz w:val="27"/>
+          <w:szCs w:val="27"/>
+        </w:rPr>
+      </w:pPr>
+      <w:r>
+        <w:rPr>
+          <w:rFonts w:ascii="Times" w:hAnsi="Times"/>
+          <w:color w:val="000000"/>
+          <w:sz w:val="27"/>
+          <w:szCs w:val="27"/>
+        </w:rPr>
+        <w:t>4.</w:t>
+      </w:r>
+    </w:p>
+    <w:p>
+      <w:pPr>
+        <w:pStyle w:val="NormalWeb"/>
+        <w:rPr>
+          <w:rFonts w:ascii="Times" w:hAnsi="Times"/>
+          <w:color w:val="000000"/>
+          <w:sz w:val="27"/>
+          <w:szCs w:val="27"/>
+        </w:rPr>
+      </w:pPr>
+      <w:r>
+        <w:rPr>
+          <w:rFonts w:ascii="Times" w:hAnsi="Times"/>
+          <w:color w:val="000000"/>
+          <w:sz w:val="27"/>
+          <w:szCs w:val="27"/>
+        </w:rPr>
+        <w:t>Set up the CI/CD pipeline early and continuously improve it</w:t>
+      </w:r>
+    </w:p>
+    <w:p>
+      <w:pPr>
+        <w:pStyle w:val="NormalWeb"/>
+        <w:rPr>
+          <w:rFonts w:ascii="Times" w:hAnsi="Times"/>
+          <w:color w:val="000000"/>
+          <w:sz w:val="27"/>
+          <w:szCs w:val="27"/>
+        </w:rPr>
+      </w:pPr>
+      <w:r>
+        <w:rPr>
+          <w:rFonts w:ascii="Times" w:hAnsi="Times"/>
+          <w:color w:val="000000"/>
+          <w:sz w:val="27"/>
+          <w:szCs w:val="27"/>
+        </w:rPr>
         <w:t>5.</w:t>
       </w:r>
     </w:p>
@@ -1700,147 +2903,7 @@
           <w:sz w:val="27"/>
           <w:szCs w:val="27"/>
         </w:rPr>
-        <w:t>Testing Suite:</w:t>
-      </w:r>
-    </w:p>
-    <w:p>
-      <w:pPr>
-        <w:pStyle w:val="NormalWeb"/>
-        <w:rPr>
-          <w:rFonts w:ascii="Times" w:hAnsi="Times"/>
-          <w:color w:val="000000"/>
-          <w:sz w:val="27"/>
-          <w:szCs w:val="27"/>
-        </w:rPr>
-      </w:pPr>
-      <w:r>
-        <w:rPr>
-          <w:rFonts w:ascii="Times" w:hAnsi="Times"/>
-          <w:color w:val="000000"/>
-          <w:sz w:val="27"/>
-          <w:szCs w:val="27"/>
-        </w:rPr>
-        <w:t>Implement comprehensive unit tests for all modules</w:t>
-      </w:r>
-    </w:p>
-    <w:p>
-      <w:pPr>
-        <w:pStyle w:val="NormalWeb"/>
-        <w:rPr>
-          <w:rFonts w:ascii="Times" w:hAnsi="Times"/>
-          <w:color w:val="000000"/>
-          <w:sz w:val="27"/>
-          <w:szCs w:val="27"/>
-        </w:rPr>
-      </w:pPr>
-      <w:r>
-        <w:rPr>
-          <w:rFonts w:ascii="Times" w:hAnsi="Times"/>
-          <w:color w:val="000000"/>
-          <w:sz w:val="27"/>
-          <w:szCs w:val="27"/>
-        </w:rPr>
-        <w:t xml:space="preserve">python -m </w:t>
-      </w:r>
-      <w:proofErr w:type="spellStart"/>
-      <w:r>
-        <w:rPr>
-          <w:rFonts w:ascii="Times" w:hAnsi="Times"/>
-          <w:color w:val="000000"/>
-          <w:sz w:val="27"/>
-          <w:szCs w:val="27"/>
-        </w:rPr>
-        <w:t>unittest</w:t>
-      </w:r>
-      <w:proofErr w:type="spellEnd"/>
-      <w:r>
-        <w:rPr>
-          <w:rFonts w:ascii="Times" w:hAnsi="Times"/>
-          <w:color w:val="000000"/>
-          <w:sz w:val="27"/>
-          <w:szCs w:val="27"/>
-        </w:rPr>
-        <w:t xml:space="preserve"> discover -v tests/unit</w:t>
-      </w:r>
-    </w:p>
-    <w:p>
-      <w:pPr>
-        <w:pStyle w:val="NormalWeb"/>
-        <w:rPr>
-          <w:rFonts w:ascii="Times" w:hAnsi="Times"/>
-          <w:color w:val="000000"/>
-          <w:sz w:val="27"/>
-          <w:szCs w:val="27"/>
-        </w:rPr>
-      </w:pPr>
-      <w:r>
-        <w:rPr>
-          <w:rFonts w:ascii="Times" w:hAnsi="Times"/>
-          <w:color w:val="000000"/>
-          <w:sz w:val="27"/>
-          <w:szCs w:val="27"/>
-        </w:rPr>
-        <w:t>Develop integration tests for the entire pipeline</w:t>
-      </w:r>
-    </w:p>
-    <w:p>
-      <w:pPr>
-        <w:pStyle w:val="NormalWeb"/>
-        <w:rPr>
-          <w:rFonts w:ascii="Times" w:hAnsi="Times"/>
-          <w:color w:val="000000"/>
-          <w:sz w:val="27"/>
-          <w:szCs w:val="27"/>
-        </w:rPr>
-      </w:pPr>
-      <w:r>
-        <w:rPr>
-          <w:rFonts w:ascii="Times" w:hAnsi="Times"/>
-          <w:color w:val="000000"/>
-          <w:sz w:val="27"/>
-          <w:szCs w:val="27"/>
-        </w:rPr>
-        <w:t xml:space="preserve">python -m </w:t>
-      </w:r>
-      <w:proofErr w:type="spellStart"/>
-      <w:r>
-        <w:rPr>
-          <w:rFonts w:ascii="Times" w:hAnsi="Times"/>
-          <w:color w:val="000000"/>
-          <w:sz w:val="27"/>
-          <w:szCs w:val="27"/>
-        </w:rPr>
-        <w:t>unittest</w:t>
-      </w:r>
-      <w:proofErr w:type="spellEnd"/>
-      <w:r>
-        <w:rPr>
-          <w:rFonts w:ascii="Times" w:hAnsi="Times"/>
-          <w:color w:val="000000"/>
-          <w:sz w:val="27"/>
-          <w:szCs w:val="27"/>
-        </w:rPr>
-        <w:t xml:space="preserve"> tests/integration/test_transactions_ingestion.py</w:t>
-      </w:r>
-    </w:p>
-    <w:p>
-      <w:pPr>
-        <w:pStyle w:val="NormalWeb"/>
-        <w:rPr>
-          <w:rFonts w:ascii="Times" w:hAnsi="Times"/>
-          <w:color w:val="000000"/>
-          <w:sz w:val="27"/>
-          <w:szCs w:val="27"/>
-        </w:rPr>
-      </w:pPr>
-      <w:r>
-        <w:rPr>
-          <w:rFonts w:ascii="Times" w:hAnsi="Times"/>
-          <w:color w:val="000000"/>
-          <w:sz w:val="27"/>
-          <w:szCs w:val="27"/>
-        </w:rPr>
-        <w:t>Create system tests to ensure end-to-end functionality</w:t>
+        <w:t>Regularly perform code reviews and refactoring</w:t>
       </w:r>
     </w:p>
     <w:p>
@@ -1880,698 +2943,6 @@
           <w:sz w:val="27"/>
           <w:szCs w:val="27"/>
         </w:rPr>
-        <w:t>CI/CD Pipeline:</w:t>
-      </w:r>
-    </w:p>
-    <w:p>
-      <w:pPr>
-        <w:pStyle w:val="NormalWeb"/>
-        <w:rPr>
-          <w:rFonts w:ascii="Times" w:hAnsi="Times"/>
-          <w:color w:val="000000"/>
-          <w:sz w:val="27"/>
-          <w:szCs w:val="27"/>
-        </w:rPr>
-      </w:pPr>
-      <w:r>
-        <w:rPr>
-          <w:rFonts w:ascii="Times" w:hAnsi="Times"/>
-          <w:color w:val="000000"/>
-          <w:sz w:val="27"/>
-          <w:szCs w:val="27"/>
-        </w:rPr>
-        <w:t>Set up a GitHub repository with proper branching strategy</w:t>
-      </w:r>
-    </w:p>
-    <w:p>
-      <w:pPr>
-        <w:pStyle w:val="NormalWeb"/>
-        <w:rPr>
-          <w:rFonts w:ascii="Times" w:hAnsi="Times"/>
-          <w:color w:val="000000"/>
-          <w:sz w:val="27"/>
-          <w:szCs w:val="27"/>
-        </w:rPr>
-      </w:pPr>
-      <w:r>
-        <w:rPr>
-          <w:rFonts w:ascii="Times" w:hAnsi="Times"/>
-          <w:color w:val="000000"/>
-          <w:sz w:val="27"/>
-          <w:szCs w:val="27"/>
-        </w:rPr>
-        <w:t>Implement a CI/CD pipeline using GitHub Actions</w:t>
-      </w:r>
-    </w:p>
-    <w:p>
-      <w:pPr>
-        <w:pStyle w:val="NormalWeb"/>
-        <w:rPr>
-          <w:rFonts w:ascii="Times" w:hAnsi="Times"/>
-          <w:color w:val="000000"/>
-          <w:sz w:val="27"/>
-          <w:szCs w:val="27"/>
-        </w:rPr>
-      </w:pPr>
-      <w:r>
-        <w:rPr>
-          <w:rFonts w:ascii="Times" w:hAnsi="Times"/>
-          <w:color w:val="000000"/>
-          <w:sz w:val="27"/>
-          <w:szCs w:val="27"/>
-        </w:rPr>
-        <w:t>Include automated testing, linting, and deployment stages</w:t>
-      </w:r>
-    </w:p>
-    <w:p>
-      <w:pPr>
-        <w:pStyle w:val="NormalWeb"/>
-        <w:rPr>
-          <w:rFonts w:ascii="Times" w:hAnsi="Times"/>
-          <w:color w:val="000000"/>
-          <w:sz w:val="27"/>
-          <w:szCs w:val="27"/>
-        </w:rPr>
-      </w:pPr>
-      <w:r>
-        <w:rPr>
-          <w:rFonts w:ascii="Times" w:hAnsi="Times"/>
-          <w:color w:val="000000"/>
-          <w:sz w:val="27"/>
-          <w:szCs w:val="27"/>
-        </w:rPr>
-        <w:t>7.</w:t>
-      </w:r>
-    </w:p>
-    <w:p>
-      <w:pPr>
-        <w:pStyle w:val="NormalWeb"/>
-        <w:rPr>
-          <w:rFonts w:ascii="Times" w:hAnsi="Times"/>
-          <w:color w:val="000000"/>
-          <w:sz w:val="27"/>
-          <w:szCs w:val="27"/>
-        </w:rPr>
-      </w:pPr>
-      <w:r>
-        <w:rPr>
-          <w:rFonts w:ascii="Times" w:hAnsi="Times"/>
-          <w:color w:val="000000"/>
-          <w:sz w:val="27"/>
-          <w:szCs w:val="27"/>
-        </w:rPr>
-        <w:t>Documentation and Code Quality:</w:t>
-      </w:r>
-    </w:p>
-    <w:p>
-      <w:pPr>
-        <w:pStyle w:val="NormalWeb"/>
-        <w:rPr>
-          <w:rFonts w:ascii="Times" w:hAnsi="Times"/>
-          <w:color w:val="000000"/>
-          <w:sz w:val="27"/>
-          <w:szCs w:val="27"/>
-        </w:rPr>
-      </w:pPr>
-      <w:r>
-        <w:rPr>
-          <w:rFonts w:ascii="Times" w:hAnsi="Times"/>
-          <w:color w:val="000000"/>
-          <w:sz w:val="27"/>
-          <w:szCs w:val="27"/>
-        </w:rPr>
-        <w:t>Write clear and comprehensive documentation for the project</w:t>
-      </w:r>
-    </w:p>
-    <w:p>
-      <w:pPr>
-        <w:pStyle w:val="NormalWeb"/>
-        <w:rPr>
-          <w:rFonts w:ascii="Times" w:hAnsi="Times"/>
-          <w:color w:val="000000"/>
-          <w:sz w:val="27"/>
-          <w:szCs w:val="27"/>
-        </w:rPr>
-      </w:pPr>
-      <w:r>
-        <w:rPr>
-          <w:rFonts w:ascii="Times" w:hAnsi="Times"/>
-          <w:color w:val="000000"/>
-          <w:sz w:val="27"/>
-          <w:szCs w:val="27"/>
-        </w:rPr>
-        <w:t>Implement proper logging and error handling</w:t>
-      </w:r>
-    </w:p>
-    <w:p>
-      <w:pPr>
-        <w:pStyle w:val="NormalWeb"/>
-        <w:rPr>
-          <w:rFonts w:ascii="Times" w:hAnsi="Times"/>
-          <w:color w:val="000000"/>
-          <w:sz w:val="27"/>
-          <w:szCs w:val="27"/>
-        </w:rPr>
-      </w:pPr>
-      <w:r>
-        <w:rPr>
-          <w:rFonts w:ascii="Times" w:hAnsi="Times"/>
-          <w:color w:val="000000"/>
-          <w:sz w:val="27"/>
-          <w:szCs w:val="27"/>
-        </w:rPr>
-        <w:t>Follow PEP 8 style guide and use type hints</w:t>
-      </w:r>
-    </w:p>
-    <w:p>
-      <w:pPr>
-        <w:pStyle w:val="NormalWeb"/>
-        <w:rPr>
-          <w:rFonts w:ascii="Times" w:hAnsi="Times"/>
-          <w:color w:val="000000"/>
-          <w:sz w:val="27"/>
-          <w:szCs w:val="27"/>
-        </w:rPr>
-      </w:pPr>
-      <w:r>
-        <w:rPr>
-          <w:rFonts w:ascii="Times" w:hAnsi="Times"/>
-          <w:color w:val="000000"/>
-          <w:sz w:val="27"/>
-          <w:szCs w:val="27"/>
-        </w:rPr>
-        <w:t>8.</w:t>
-      </w:r>
-    </w:p>
-    <w:p>
-      <w:pPr>
-        <w:pStyle w:val="NormalWeb"/>
-        <w:rPr>
-          <w:rFonts w:ascii="Times" w:hAnsi="Times"/>
-          <w:color w:val="000000"/>
-          <w:sz w:val="27"/>
-          <w:szCs w:val="27"/>
-        </w:rPr>
-      </w:pPr>
-      <w:r>
-        <w:rPr>
-          <w:rFonts w:ascii="Times" w:hAnsi="Times"/>
-          <w:color w:val="000000"/>
-          <w:sz w:val="27"/>
-          <w:szCs w:val="27"/>
-        </w:rPr>
-        <w:t>Containerization:</w:t>
-      </w:r>
-    </w:p>
-    <w:p>
-      <w:pPr>
-        <w:pStyle w:val="NormalWeb"/>
-        <w:rPr>
-          <w:rFonts w:ascii="Times" w:hAnsi="Times"/>
-          <w:color w:val="000000"/>
-          <w:sz w:val="27"/>
-          <w:szCs w:val="27"/>
-        </w:rPr>
-      </w:pPr>
-      <w:proofErr w:type="spellStart"/>
-      <w:r>
-        <w:rPr>
-          <w:rFonts w:ascii="Times" w:hAnsi="Times"/>
-          <w:color w:val="000000"/>
-          <w:sz w:val="27"/>
-          <w:szCs w:val="27"/>
-        </w:rPr>
-        <w:t>Dockerize</w:t>
-      </w:r>
-      <w:proofErr w:type="spellEnd"/>
-      <w:r>
-        <w:rPr>
-          <w:rFonts w:ascii="Times" w:hAnsi="Times"/>
-          <w:color w:val="000000"/>
-          <w:sz w:val="27"/>
-          <w:szCs w:val="27"/>
-        </w:rPr>
-        <w:t xml:space="preserve"> the application for easy deployment</w:t>
-      </w:r>
-    </w:p>
-    <w:p>
-      <w:pPr>
-        <w:pStyle w:val="NormalWeb"/>
-        <w:rPr>
-          <w:rFonts w:ascii="Times" w:hAnsi="Times"/>
-          <w:color w:val="000000"/>
-          <w:sz w:val="27"/>
-          <w:szCs w:val="27"/>
-        </w:rPr>
-      </w:pPr>
-      <w:r>
-        <w:rPr>
-          <w:rFonts w:ascii="Times" w:hAnsi="Times"/>
-          <w:color w:val="000000"/>
-          <w:sz w:val="27"/>
-          <w:szCs w:val="27"/>
-        </w:rPr>
-        <w:t>Create docker-compose file for local development and testing</w:t>
-      </w:r>
-    </w:p>
-    <w:p>
-      <w:pPr>
-        <w:pStyle w:val="NormalWeb"/>
-        <w:rPr>
-          <w:rFonts w:ascii="Times" w:hAnsi="Times"/>
-          <w:color w:val="000000"/>
-          <w:sz w:val="27"/>
-          <w:szCs w:val="27"/>
-        </w:rPr>
-      </w:pPr>
-      <w:r>
-        <w:rPr>
-          <w:rFonts w:ascii="Times" w:hAnsi="Times"/>
-          <w:color w:val="000000"/>
-          <w:sz w:val="27"/>
-          <w:szCs w:val="27"/>
-        </w:rPr>
-        <w:t>9.</w:t>
-      </w:r>
-    </w:p>
-    <w:p>
-      <w:pPr>
-        <w:pStyle w:val="NormalWeb"/>
-        <w:rPr>
-          <w:rFonts w:ascii="Times" w:hAnsi="Times"/>
-          <w:color w:val="000000"/>
-          <w:sz w:val="27"/>
-          <w:szCs w:val="27"/>
-        </w:rPr>
-      </w:pPr>
-      <w:r>
-        <w:rPr>
-          <w:rFonts w:ascii="Times" w:hAnsi="Times"/>
-          <w:color w:val="000000"/>
-          <w:sz w:val="27"/>
-          <w:szCs w:val="27"/>
-        </w:rPr>
-        <w:t>Project Management:</w:t>
-      </w:r>
-    </w:p>
-    <w:p>
-      <w:pPr>
-        <w:pStyle w:val="NormalWeb"/>
-        <w:rPr>
-          <w:rFonts w:ascii="Times" w:hAnsi="Times"/>
-          <w:color w:val="000000"/>
-          <w:sz w:val="27"/>
-          <w:szCs w:val="27"/>
-        </w:rPr>
-      </w:pPr>
-      <w:r>
-        <w:rPr>
-          <w:rFonts w:ascii="Times" w:hAnsi="Times"/>
-          <w:color w:val="000000"/>
-          <w:sz w:val="27"/>
-          <w:szCs w:val="27"/>
-        </w:rPr>
-        <w:t>Set up a Jira board (or a similar tool) to track tasks and progress</w:t>
-      </w:r>
-    </w:p>
-    <w:p>
-      <w:pPr>
-        <w:pStyle w:val="NormalWeb"/>
-        <w:rPr>
-          <w:rFonts w:ascii="Times" w:hAnsi="Times"/>
-          <w:color w:val="000000"/>
-          <w:sz w:val="27"/>
-          <w:szCs w:val="27"/>
-        </w:rPr>
-      </w:pPr>
-      <w:r>
-        <w:rPr>
-          <w:rFonts w:ascii="Times" w:hAnsi="Times"/>
-          <w:color w:val="000000"/>
-          <w:sz w:val="27"/>
-          <w:szCs w:val="27"/>
-        </w:rPr>
-        <w:lastRenderedPageBreak/>
-        <w:t>Use Confluence (or a similar wiki) for project documentation</w:t>
-      </w:r>
-    </w:p>
-    <w:p>
-      <w:pPr>
-        <w:pStyle w:val="NormalWeb"/>
-        <w:rPr>
-          <w:rFonts w:ascii="Times" w:hAnsi="Times"/>
-          <w:color w:val="000000"/>
-          <w:sz w:val="27"/>
-          <w:szCs w:val="27"/>
-        </w:rPr>
-      </w:pPr>
-      <w:r>
-        <w:rPr>
-          <w:rFonts w:ascii="Times" w:hAnsi="Times"/>
-          <w:color w:val="000000"/>
-          <w:sz w:val="27"/>
-          <w:szCs w:val="27"/>
-        </w:rPr>
-        <w:t>10.</w:t>
-      </w:r>
-    </w:p>
-    <w:p>
-      <w:pPr>
-        <w:pStyle w:val="NormalWeb"/>
-        <w:rPr>
-          <w:rFonts w:ascii="Times" w:hAnsi="Times"/>
-          <w:color w:val="000000"/>
-          <w:sz w:val="27"/>
-          <w:szCs w:val="27"/>
-        </w:rPr>
-      </w:pPr>
-      <w:r>
-        <w:rPr>
-          <w:rFonts w:ascii="Times" w:hAnsi="Times"/>
-          <w:color w:val="000000"/>
-          <w:sz w:val="27"/>
-          <w:szCs w:val="27"/>
-        </w:rPr>
-        <w:t>Bonus Features:</w:t>
-      </w:r>
-    </w:p>
-    <w:p>
-      <w:pPr>
-        <w:pStyle w:val="NormalWeb"/>
-        <w:rPr>
-          <w:rFonts w:ascii="Times" w:hAnsi="Times"/>
-          <w:color w:val="000000"/>
-          <w:sz w:val="27"/>
-          <w:szCs w:val="27"/>
-        </w:rPr>
-      </w:pPr>
-      <w:r>
-        <w:rPr>
-          <w:rFonts w:ascii="Times" w:hAnsi="Times"/>
-          <w:color w:val="000000"/>
-          <w:sz w:val="27"/>
-          <w:szCs w:val="27"/>
-        </w:rPr>
-        <w:t>Implement data versioning using a tool like DVC (Data Version Control)</w:t>
-      </w:r>
-    </w:p>
-    <w:p>
-      <w:pPr>
-        <w:pStyle w:val="NormalWeb"/>
-        <w:rPr>
-          <w:rFonts w:ascii="Times" w:hAnsi="Times"/>
-          <w:color w:val="000000"/>
-          <w:sz w:val="27"/>
-          <w:szCs w:val="27"/>
-        </w:rPr>
-      </w:pPr>
-      <w:r>
-        <w:rPr>
-          <w:rFonts w:ascii="Times" w:hAnsi="Times"/>
-          <w:color w:val="000000"/>
-          <w:sz w:val="27"/>
-          <w:szCs w:val="27"/>
-        </w:rPr>
-        <w:t>Add a feature for exporting reports in various formats (PDF, Excel)</w:t>
-      </w:r>
-    </w:p>
-    <w:p>
-      <w:pPr>
-        <w:pStyle w:val="NormalWeb"/>
-        <w:rPr>
-          <w:rFonts w:ascii="Times" w:hAnsi="Times"/>
-          <w:color w:val="000000"/>
-          <w:sz w:val="27"/>
-          <w:szCs w:val="27"/>
-        </w:rPr>
-      </w:pPr>
-      <w:r>
-        <w:rPr>
-          <w:rFonts w:ascii="Times" w:hAnsi="Times"/>
-          <w:color w:val="000000"/>
-          <w:sz w:val="27"/>
-          <w:szCs w:val="27"/>
-        </w:rPr>
-        <w:t>Implement role-based access control for the dashboard</w:t>
-      </w:r>
-    </w:p>
-    <w:p>
-      <w:pPr>
-        <w:pStyle w:val="NormalWeb"/>
-        <w:rPr>
-          <w:rFonts w:ascii="Times" w:hAnsi="Times"/>
-          <w:color w:val="000000"/>
-          <w:sz w:val="27"/>
-          <w:szCs w:val="27"/>
-        </w:rPr>
-      </w:pPr>
-      <w:r>
-        <w:rPr>
-          <w:rFonts w:ascii="Times" w:hAnsi="Times"/>
-          <w:color w:val="000000"/>
-          <w:sz w:val="27"/>
-          <w:szCs w:val="27"/>
-        </w:rPr>
-        <w:t>Development Approach:</w:t>
-      </w:r>
-    </w:p>
-    <w:p>
-      <w:pPr>
-        <w:pStyle w:val="NormalWeb"/>
-        <w:rPr>
-          <w:rFonts w:ascii="Times" w:hAnsi="Times"/>
-          <w:color w:val="000000"/>
-          <w:sz w:val="27"/>
-          <w:szCs w:val="27"/>
-        </w:rPr>
-      </w:pPr>
-      <w:r>
-        <w:rPr>
-          <w:rFonts w:ascii="Times" w:hAnsi="Times"/>
-          <w:color w:val="000000"/>
-          <w:sz w:val="27"/>
-          <w:szCs w:val="27"/>
-        </w:rPr>
-        <w:t>1.</w:t>
-      </w:r>
-    </w:p>
-    <w:p>
-      <w:pPr>
-        <w:pStyle w:val="NormalWeb"/>
-        <w:rPr>
-          <w:rFonts w:ascii="Times" w:hAnsi="Times"/>
-          <w:color w:val="000000"/>
-          <w:sz w:val="27"/>
-          <w:szCs w:val="27"/>
-        </w:rPr>
-      </w:pPr>
-      <w:r>
-        <w:rPr>
-          <w:rFonts w:ascii="Times" w:hAnsi="Times"/>
-          <w:color w:val="000000"/>
-          <w:sz w:val="27"/>
-          <w:szCs w:val="27"/>
-        </w:rPr>
-        <w:t>Start by setting up the project structure and GitHub repository</w:t>
-      </w:r>
-    </w:p>
-    <w:p>
-      <w:pPr>
-        <w:pStyle w:val="NormalWeb"/>
-        <w:rPr>
-          <w:rFonts w:ascii="Times" w:hAnsi="Times"/>
-          <w:color w:val="000000"/>
-          <w:sz w:val="27"/>
-          <w:szCs w:val="27"/>
-        </w:rPr>
-      </w:pPr>
-      <w:r>
-        <w:rPr>
-          <w:rFonts w:ascii="Times" w:hAnsi="Times"/>
-          <w:color w:val="000000"/>
-          <w:sz w:val="27"/>
-          <w:szCs w:val="27"/>
-        </w:rPr>
-        <w:t>2.</w:t>
-      </w:r>
-    </w:p>
-    <w:p>
-      <w:pPr>
-        <w:pStyle w:val="NormalWeb"/>
-        <w:rPr>
-          <w:rFonts w:ascii="Times" w:hAnsi="Times"/>
-          <w:color w:val="000000"/>
-          <w:sz w:val="27"/>
-          <w:szCs w:val="27"/>
-        </w:rPr>
-      </w:pPr>
-      <w:r>
-        <w:rPr>
-          <w:rFonts w:ascii="Times" w:hAnsi="Times"/>
-          <w:color w:val="000000"/>
-          <w:sz w:val="27"/>
-          <w:szCs w:val="27"/>
-        </w:rPr>
-        <w:t>Implement the core data processing functionality using TDD (Test-Driven Development)</w:t>
-      </w:r>
-    </w:p>
-    <w:p>
-      <w:pPr>
-        <w:pStyle w:val="NormalWeb"/>
-        <w:rPr>
-          <w:rFonts w:ascii="Times" w:hAnsi="Times"/>
-          <w:color w:val="000000"/>
-          <w:sz w:val="27"/>
-          <w:szCs w:val="27"/>
-        </w:rPr>
-      </w:pPr>
-      <w:r>
-        <w:rPr>
-          <w:rFonts w:ascii="Times" w:hAnsi="Times"/>
-          <w:color w:val="000000"/>
-          <w:sz w:val="27"/>
-          <w:szCs w:val="27"/>
-        </w:rPr>
-        <w:t>3.</w:t>
-      </w:r>
-    </w:p>
-    <w:p>
-      <w:pPr>
-        <w:pStyle w:val="NormalWeb"/>
-        <w:rPr>
-          <w:rFonts w:ascii="Times" w:hAnsi="Times"/>
-          <w:color w:val="000000"/>
-          <w:sz w:val="27"/>
-          <w:szCs w:val="27"/>
-        </w:rPr>
-      </w:pPr>
-      <w:r>
-        <w:rPr>
-          <w:rFonts w:ascii="Times" w:hAnsi="Times"/>
-          <w:color w:val="000000"/>
-          <w:sz w:val="27"/>
-          <w:szCs w:val="27"/>
-        </w:rPr>
-        <w:t>Develop the analytics engine and dashboard iteratively</w:t>
-      </w:r>
-    </w:p>
-    <w:p>
-      <w:pPr>
-        <w:pStyle w:val="NormalWeb"/>
-        <w:rPr>
-          <w:rFonts w:ascii="Times" w:hAnsi="Times"/>
-          <w:color w:val="000000"/>
-          <w:sz w:val="27"/>
-          <w:szCs w:val="27"/>
-        </w:rPr>
-      </w:pPr>
-      <w:r>
-        <w:rPr>
-          <w:rFonts w:ascii="Times" w:hAnsi="Times"/>
-          <w:color w:val="000000"/>
-          <w:sz w:val="27"/>
-          <w:szCs w:val="27"/>
-        </w:rPr>
-        <w:t>4.</w:t>
-      </w:r>
-    </w:p>
-    <w:p>
-      <w:pPr>
-        <w:pStyle w:val="NormalWeb"/>
-        <w:rPr>
-          <w:rFonts w:ascii="Times" w:hAnsi="Times"/>
-          <w:color w:val="000000"/>
-          <w:sz w:val="27"/>
-          <w:szCs w:val="27"/>
-        </w:rPr>
-      </w:pPr>
-      <w:r>
-        <w:rPr>
-          <w:rFonts w:ascii="Times" w:hAnsi="Times"/>
-          <w:color w:val="000000"/>
-          <w:sz w:val="27"/>
-          <w:szCs w:val="27"/>
-        </w:rPr>
-        <w:t>Set up the CI/CD pipeline early and continuously improve it</w:t>
-      </w:r>
-    </w:p>
-    <w:p>
-      <w:pPr>
-        <w:pStyle w:val="NormalWeb"/>
-        <w:rPr>
-          <w:rFonts w:ascii="Times" w:hAnsi="Times"/>
-          <w:color w:val="000000"/>
-          <w:sz w:val="27"/>
-          <w:szCs w:val="27"/>
-        </w:rPr>
-      </w:pPr>
-      <w:r>
-        <w:rPr>
-          <w:rFonts w:ascii="Times" w:hAnsi="Times"/>
-          <w:color w:val="000000"/>
-          <w:sz w:val="27"/>
-          <w:szCs w:val="27"/>
-        </w:rPr>
-        <w:t>5.</w:t>
-      </w:r>
-    </w:p>
-    <w:p>
-      <w:pPr>
-        <w:pStyle w:val="NormalWeb"/>
-        <w:rPr>
-          <w:rFonts w:ascii="Times" w:hAnsi="Times"/>
-          <w:color w:val="000000"/>
-          <w:sz w:val="27"/>
-          <w:szCs w:val="27"/>
-        </w:rPr>
-      </w:pPr>
-      <w:r>
-        <w:rPr>
-          <w:rFonts w:ascii="Times" w:hAnsi="Times"/>
-          <w:color w:val="000000"/>
-          <w:sz w:val="27"/>
-          <w:szCs w:val="27"/>
-        </w:rPr>
-        <w:t>Regularly perform code reviews and refactoring</w:t>
-      </w:r>
-    </w:p>
-    <w:p>
-      <w:pPr>
-        <w:pStyle w:val="NormalWeb"/>
-        <w:rPr>
-          <w:rFonts w:ascii="Times" w:hAnsi="Times"/>
-          <w:color w:val="000000"/>
-          <w:sz w:val="27"/>
-          <w:szCs w:val="27"/>
-        </w:rPr>
-      </w:pPr>
-      <w:r>
-        <w:rPr>
-          <w:rFonts w:ascii="Times" w:hAnsi="Times"/>
-          <w:color w:val="000000"/>
-          <w:sz w:val="27"/>
-          <w:szCs w:val="27"/>
-        </w:rPr>
-        <w:t>6.</w:t>
-      </w:r>
-    </w:p>
-    <w:p>
-      <w:pPr>
-        <w:pStyle w:val="NormalWeb"/>
-        <w:rPr>
-          <w:rFonts w:ascii="Times" w:hAnsi="Times"/>
-          <w:color w:val="000000"/>
-          <w:sz w:val="27"/>
-          <w:szCs w:val="27"/>
-        </w:rPr>
-      </w:pPr>
-      <w:r>
-        <w:rPr>
-          <w:rFonts w:ascii="Times" w:hAnsi="Times"/>
-          <w:color w:val="000000"/>
-          <w:sz w:val="27"/>
-          <w:szCs w:val="27"/>
-        </w:rPr>
         <w:t>Document the project thoroughly, including setup instructions, API documentation, and user guide</w:t>
       </w:r>
     </w:p>
@@ -2672,7 +3043,6 @@
           <w:sz w:val="27"/>
           <w:szCs w:val="27"/>
         </w:rPr>
-        <w:lastRenderedPageBreak/>
         <w:t>Experience with testing at various levels</w:t>
       </w:r>
     </w:p>

</xml_diff>